<commit_message>
Merge Introduction + Literature into one 824-word section; cite all 51 references; renumber sections
</commit_message>
<xml_diff>
--- a/Research_Article_TEHD_Journal_Bearing.docx
+++ b/Research_Article_TEHD_Journal_Bearing.docx
@@ -48,35 +48,49 @@
         <w:pStyle w:val="Heading1"/>
       </w:pPr>
       <w:r>
-        <w:t xml:space="preserve">1. Introduction</w:t>
-      </w:r>
-    </w:p>
-    <w:p/>
-    <w:p>
-      <w:pPr/>
-      <w:r>
-        <w:t xml:space="preserve">Hydrodynamic journal bearings remain the dominant load-carrying element in rotating machinery, supporting turbine, compressor, pump, engine, and generator shafts through a converging lubricant wedge that generates load-supporting pressure without solid contact [18, 31]. The classical Reynolds equation [23] describes this pressure field under the assumptions of a thin, iso-viscous, Newtonian film separating rigid surfaces. For modern machine elements subjected to high specific loads, elevated sliding speeds, and chemically complex lubricants, each of these assumptions is increasingly difficult to justify. Lubricants such as additive-laden mineral oils, greases, polymer-thickened oils, emulsions, and bio-lubricants deviate from the linear stress–strain-rate relation and are commonly represented by the Ostwald–de Waele power-law model [1, 12, 13]. The viscous dissipation that accompanies shearing of these films raises the lubricant temperature, which in turn lowers its consistency and alters the pressure field, so that a thermo-hydrodynamic (THD) treatment is required to predict performance realistically [5, 6, 14].</w:t>
-      </w:r>
-    </w:p>
-    <w:p/>
-    <w:p>
-      <w:pPr/>
-      <w:r>
-        <w:t xml:space="preserve">A substantial body of work has established the THD framework for power-law lubricants: Dien and Elrod [13] derived a generalised Reynolds equation for non-Newtonian fluids, Wang, Zhu, and Wen [14] analysed couple-stress films, Mishra [8] examined finite-bearing stability under adiabatic thermal and non-Newtonian effects, Peng and Khonsari [15] treated foil bearings, Liu, Zhang, and Zhang [21] proposed a one-dimensional thermal model, and Prasad and co-workers [17, 19] added squeezing, temperature, and consistency variation. Among semi-analytical approaches, Sekhar et al. [20] introduced a delta-profile concept that locates the zero-velocity-gradient surface across the film, reducing the coupled Reynolds and energy equations to a system integrated with a Runge–Kutta–Fehlberg scheme; they reported the influence of the power-law index and eccentricity ratio on pressure, temperature, and load, with agreement against two-axial-groove bearing data [11].</w:t>
-      </w:r>
-    </w:p>
-    <w:p/>
-    <w:p>
-      <w:pPr/>
-      <w:r>
-        <w:t xml:space="preserve">Despite these advances, the delta-profile model and comparable semi-analytical treatments retain two simplifications. First, the surfaces are assumed rigid, whereas the hydrodynamic pressure elastically deflects the bush and liner, enlarging the clearance, reducing and spreading the peak, and raising the minimum film thickness, especially for compliant liners and at high load [10, 33, 34]. Second, the full-film assumption admits sub-ambient pressures in the divergent region, whereas real films rupture and cavitate near the cavitation pressure [16, 24]; truncating negative pressures violates mass conservation and mispredicts flow, friction, and the reformation location [25, 26, 27].</w:t>
-      </w:r>
-    </w:p>
-    <w:p/>
-    <w:p>
-      <w:pPr/>
-      <w:r>
-        <w:t xml:space="preserve">The present work addresses both deficiencies by formulating a thermo-elasto-hydrodynamic (TEHD) model that augments the power-law delta-profile THD framework with elastic deformation and mass-conserving cavitation. The specific objectives are: (a) to derive the coupled governing equations — a generalised power-law Reynolds equation, an elastic compliance film-thickness relation, a JFO/Elrod–Adams cavitation formulation, and a conjugate energy equation; (b) to establish a staggered solution algorithm that recovers the rigid, full-film THD solution as a limiting case; (c) to validate the model against independent experimental and numerical benchmarks; and (d) to analyse, with reference to the prior literature, how elasticity and cavitation modify the pressure, temperature, and load for Newtonian and non-Newtonian lubricants.</w:t>
+        <w:t xml:space="preserve">1. Introduction and Literature Review</w:t>
+      </w:r>
+    </w:p>
+    <w:p/>
+    <w:p>
+      <w:pPr/>
+      <w:r>
+        <w:t xml:space="preserve">Hydrodynamic journal bearings remain the dominant load-carrying element in rotating machinery, supporting turbine, compressor, pump, engine, and generator shafts through a converging lubricant wedge that generates pressure without solid contact [18, 31, 51]. The classical Reynolds equation [23], later generalised by Dowson [32], describes this pressure field for a thin, iso-viscous, Newtonian film between rigid surfaces. For modern machine elements under high specific load, elevated speed, and chemically complex lubricants, each of these assumptions is difficult to justify, which has driven decades of effort toward non-Newtonian rheology, thermal coupling, elastic deformation, and cavitation.</w:t>
+      </w:r>
+    </w:p>
+    <w:p/>
+    <w:p>
+      <w:pPr/>
+      <w:r>
+        <w:t xml:space="preserve">Practical lubricants — additive-laden mineral oils, greases, polymer-thickened oils, emulsions, and bio-lubricants — deviate from the linear stress–strain-rate law and are most often represented by the Ostwald–de Waele power-law model [1, 12, 13]. Oliver [1] showed experimentally that polymer thickening enhances load capacity, and Dien and Elrod [13] gave the subject a firm footing with a generalised Reynolds equation; the power-law description is favoured for its two-parameter economy, a consistency and a flow-behaviour index distinguishing pseudo-plastic, Newtonian, and dilatant behaviour [8, 17, 19, 22]. Experimental and integral-transform studies [2, 3] mapped the resulting pressure field, while recent finite-volume [37], two-lobe [40], and grooved-rubber [41] analyses confirm that the flow index is a first-order design parameter, with shear-thickening fluids generally outperforming shear-thinning ones.</w:t>
+      </w:r>
+    </w:p>
+    <w:p/>
+    <w:p>
+      <w:pPr/>
+      <w:r>
+        <w:t xml:space="preserve">Because viscous dissipation both heats the film and, through the temperature dependence of consistency, feeds back on pressure, non-Newtonian analysis is inseparable from thermal analysis. Ma and Taylor [5] measured significant circumferential and axial temperature variation, and Sun et al. [6] reported the influence of temperature on load, leakage, and friction in misaligned rough bearings. Simplified one-dimensional models [21] capture the leading-order rise but omit heat conducted into the solids; conjugate thermo-hydrodynamic (THD) treatments that solve the solid-conduction field with the film energy equation predict metal temperatures between the adiabatic and isothermal limits and are more realistic [14, 36]. Peng and Khonsari [15] developed a THD analysis of compliant foil bearings, and CFD studies confirm conjugate effects are essential at elevated Reynolds number [39, 44]. Among semi-analytical methods — valued for the physical insight their closed forms provide [4, 49, 50] — Sekhar et al. [20] introduced a delta-profile concept that locates the zero-velocity-gradient surface across the film, reducing the coupled Reynolds and energy equations to a system integrated with a Runge–Kutta–Fehlberg scheme, and validated it against two-axial-groove bearing data [11].</w:t>
+      </w:r>
+    </w:p>
+    <w:p/>
+    <w:p>
+      <w:pPr/>
+      <w:r>
+        <w:t xml:space="preserve">Two idealisations nonetheless persist in the delta-profile model and comparable treatments. First, the surfaces are assumed rigid, whereas hydrodynamic pressure elastically deflects the bush and liner, enlarging the clearance, lowering and spreading the pressure peak, and raising the minimum film thickness — effects pronounced for compliant liners and at high load. Oh and Goenka [34] and Boedo and Booker [33] quantified these elastohydrodynamic trends, Fantino and Frêne [35] treated combined thermal–elastic distortion, and Linjamaa et al. [10] modelled hybrid-bearing deformation; the influence-coefficient (compliance-matrix) method is the standard device for incorporating deflection economically [33, 34]. Second, the full-film assumption admits sub-ambient pressures in the divergent clearance, whereas real films rupture and cavitate near the cavitation pressure [16, 24]. Truncating negative pressures violates mass conservation; the Jakobsson–Floberg–Olsson theory [25, 26] remedies this with a fractional-film-content variable, which Elrod and Adams [27, 28] cast as a switch-function algorithm, Vijayaraghavan and Keith [29] refined, and Bayada and Chambat [30] placed on a rigorous footing. Mass conservation materially changes the predicted pressure and load relative to non-conservative truncation [39].</w:t>
+      </w:r>
+    </w:p>
+    <w:p/>
+    <w:p>
+      <w:pPr/>
+      <w:r>
+        <w:t xml:space="preserve">A parallel stream pursues performance through lubricant and surface engineering — nanoparticle additives that raise viscosity and load capacity [38, 45, 46, 47], experimental–CFD studies of composite bearings [48], and surface texturing or topology optimisation that raises minimum film thickness and lowers friction [42, 43]. Stochastic and experimental investigations further characterise surface roughness and severe-condition behaviour [7, 9, 11]. Such refinements invariably rest on accurate thermal, elastic, and cavitation predictions, underscoring the need for an integrated framework.</w:t>
+      </w:r>
+    </w:p>
+    <w:p/>
+    <w:p>
+      <w:pPr/>
+      <w:r>
+        <w:t xml:space="preserve">The literature thus offers mature but largely separate treatments of power-law rheology [1, 13, 22], thermal effects [5, 6, 20], elastic deformation [10, 33, 34], and mass-conserving cavitation [27, 28, 30]. Scarce is a single semi-analytical framework that integrates all four within the efficient delta-profile closure, so that the flow index and eccentricity ratio can be studied without discarding either elastic realism or mass conservation. The present work fills this gap by formulating a thermo-elasto-hydrodynamic (TEHD) model that augments the power-law delta-profile THD framework with elastic deformation and mass-conserving cavitation. Its objectives are: (a) to derive the coupled governing equations — a generalised power-law Reynolds equation, a compliance film-thickness relation, a JFO/Elrod–Adams cavitation formulation, and a conjugate energy equation; (b) to establish a staggered algorithm that recovers the rigid, full-film THD solution as a limiting case; (c) to validate the model against independent experimental and numerical benchmarks; and (d) to analyse, against the prior literature, how elasticity and cavitation modify the pressure, temperature, and load for Newtonian and non-Newtonian lubricants.</w:t>
       </w:r>
     </w:p>
     <w:p/>
@@ -87,7 +101,7 @@
         <w:pStyle w:val="Heading1"/>
       </w:pPr>
       <w:r>
-        <w:t xml:space="preserve">2. Literature Analysis</w:t>
+        <w:t xml:space="preserve">2. Mathematical Modelling and Governing Equations</w:t>
       </w:r>
     </w:p>
     <w:p/>
@@ -96,137 +110,7 @@
         <w:pStyle w:val="Heading2"/>
       </w:pPr>
       <w:r>
-        <w:t xml:space="preserve">2.1 Non-Newtonian lubrication of journal bearings</w:t>
-      </w:r>
-    </w:p>
-    <w:p/>
-    <w:p>
-      <w:pPr/>
-      <w:r>
-        <w:t xml:space="preserve">The recognition that practical lubricants rarely behave as ideal Newtonian fluids has driven decades of modelling effort. Oliver [1] demonstrated experimentally that polymer thickening enhances the load capacity of a short model journal bearing, an early indication that shear-rate-dependent viscosity materially affects performance. Safar [12] analysed dynamically loaded bearings operating with non-Newtonian films, and Dien and Elrod [13] placed the subject on a firm theoretical footing with a generalised steady-state Reynolds equation applicable to a broad class of non-Newtonian fluids. The power-law model has since become the most widely adopted constitutive description because of its generality and its two-parameter economy: a consistency and a flow-behaviour index distinguish pseudo-plastic, Newtonian, and dilatant behaviour [8, 17, 41]. Nessil et al. [22] analysed journal-bearing lubrication with non-Newtonian fluids and reported that the pressure field and load capacity depend sensitively on the flow index, while Kasolong et al. [2] and Santos et al. [3] established complementary experimental and integral-transform descriptions of the hydrodynamic pressure field.</w:t>
-      </w:r>
-    </w:p>
-    <w:p/>
-    <w:p>
-      <w:pPr/>
-      <w:r>
-        <w:t xml:space="preserve">Recent studies refine this picture: a finite-volume THD analysis showed that coupling the modified power-law Reynolds equation with the energy equation shifts the predicted temperature and load relative to iso-viscous treatments [37]; a two-lobe power-law analysis found shear-thickening fluids outperform Newtonian and pseudo-plastic lubricants, with side leakage falling as geometric asymmetry rises [40]; and grooved-rubber-bearing studies confirmed the power-law description captures the dominant rheological influence [41]. Collectively these establish the flow-behaviour index as a first-order design parameter, motivating its retention here.</w:t>
-      </w:r>
-    </w:p>
-    <w:p/>
-    <w:p>
-      <w:pPr>
-        <w:pStyle w:val="Heading2"/>
-      </w:pPr>
-      <w:r>
-        <w:t xml:space="preserve">2.2 Thermal effects and conjugate heat transfer</w:t>
-      </w:r>
-    </w:p>
-    <w:p/>
-    <w:p>
-      <w:pPr/>
-      <w:r>
-        <w:t xml:space="preserve">Thermal effects are inseparable from non-Newtonian analysis because viscous dissipation both heats the film and, through the temperature dependence of consistency, feeds back on the pressure. Ma and Taylor [5] experimentally demonstrated significant circumferential and axial temperature variation in circular and elliptical bearings, and Sun et al. [6] reported the influence of temperature on load, leakage, and friction in misaligned rough bearings. Simplified one-dimensional models [21] capture the leading-order temperature rise but cannot represent heat conducted into the solids; conjugate treatments that solve the solid-conduction field with the film energy equation predict metal temperatures between the adiabatic and isothermal idealisations and are more realistic [14, 36]. The delta-profile model [20] used an exponential thermo-viscous consistency and reported that temperature increases with the flow index. The present work adds convective transport and conjugate conduction, shown by recent CFD studies [39, 44] to be essential at elevated Reynolds number.</w:t>
-      </w:r>
-    </w:p>
-    <w:p/>
-    <w:p>
-      <w:pPr>
-        <w:pStyle w:val="Heading2"/>
-      </w:pPr>
-      <w:r>
-        <w:t xml:space="preserve">2.3 Elastic deformation and elastohydrodynamic coupling</w:t>
-      </w:r>
-    </w:p>
-    <w:p/>
-    <w:p>
-      <w:pPr/>
-      <w:r>
-        <w:t xml:space="preserve">Surface elastic deformation under hydrodynamic pressure is well established in the elastohydrodynamic (EHL) literature [31]. For conformal bearings, Oh and Goenka [34] and Boedo and Booker [33] showed that compliance reduces peak pressure and raises minimum film thickness, Fantino and Frêne [35] treated combined thermal–elastic distortion, and Linjamaa et al. [10] quantified the resulting changes in load and film geometry. The influence-coefficient (compliance-matrix) method — expressing the deflection as a convolution of pressure with a precomputed elastic kernel — is the standard device for including deformation without re-solving the full elasticity problem each iteration [33, 34]. The present model adopts it, with a Winkler elastic-foundation reduction for compliant liners [10].</w:t>
-      </w:r>
-    </w:p>
-    <w:p/>
-    <w:p>
-      <w:pPr>
-        <w:pStyle w:val="Heading2"/>
-      </w:pPr>
-      <w:r>
-        <w:t xml:space="preserve">2.4 Cavitation modelling</w:t>
-      </w:r>
-    </w:p>
-    <w:p/>
-    <w:p>
-      <w:pPr/>
-      <w:r>
-        <w:t xml:space="preserve">Cavitation sets the extent of the active pressure-generating region and hence the load, friction, and leakage. Early analyses used the half-Sommerfeld or Reynolds (Swift–Stieber) condition, which zeroes pressure and its gradient at rupture but does not conserve mass at reformation [16, 24]. The Jakobsson–Floberg–Olsson (JFO) theory [25, 26] remedies this with a complementary fractional-film-content variable that conserves mass across both boundaries; Elrod and Adams [28] and Elrod [27] recast it as a switch-function algorithm with a single universal variable, Vijayaraghavan and Keith [29] refined it for journal bearings, and Bayada and Chambat [30] gave it a rigorous foundation. FSI–cavitation CFD [39] confirms that mass conservation materially changes the predicted pressure and load. The present model employs the Elrod–Adams formulation, enforcing the complementarity conditions cell by cell.</w:t>
-      </w:r>
-    </w:p>
-    <w:p/>
-    <w:p>
-      <w:pPr>
-        <w:pStyle w:val="Heading2"/>
-      </w:pPr>
-      <w:r>
-        <w:t xml:space="preserve">2.5 Advanced lubricants and surface engineering</w:t>
-      </w:r>
-    </w:p>
-    <w:p/>
-    <w:p>
-      <w:pPr/>
-      <w:r>
-        <w:t xml:space="preserve">A parallel research stream seeks gains through lubricant and surface engineering. Nanoparticle additives — titanium dioxide, carbon nanotubes, and hybrids — raise the effective viscosity and load capacity while modifying the thermal response [38, 44, 45, 46, 47], and experimental–CFD studies of composite bearings report improvements in pressure, friction, and wear [48]. Surface texturing and topology optimisation raise the minimum film thickness and reduce friction through micro-wedge and micro-reservoir effects [42, 43]. Although the present work models neither additives nor textures explicitly, it provides the thermal, elastic, and cavitation infrastructure on which such refinements depend [45, 48].</w:t>
-      </w:r>
-    </w:p>
-    <w:p/>
-    <w:p>
-      <w:pPr>
-        <w:pStyle w:val="Heading2"/>
-      </w:pPr>
-      <w:r>
-        <w:t xml:space="preserve">2.6 Semi-analytical versus fully numerical approaches</w:t>
-      </w:r>
-    </w:p>
-    <w:p/>
-    <w:p>
-      <w:pPr/>
-      <w:r>
-        <w:t xml:space="preserve">A methodological divide runs through the literature. Fully numerical approaches — finite-difference [8], finite-volume [37], and CFD with fluid–structure interaction [39, 48] — accommodate arbitrary geometry and surface features but are costly and offer limited analytical insight. Semi-analytical approaches — integral transforms [3], exact Reynolds-equation solutions [4], the mobility method [49], the dynamic-coefficient framework [50], and the delta-profile closure [20] — trade geometric generality for tractability, yielding closed-form expressions that expose the dependence on the flow index and eccentricity ratio directly. The delta-profile method is attractive because it preserves this transparency for non-Newtonian films; the present contribution is to show that elastic deformation and mass-conserving cavitation can be grafted onto it without sacrificing its central economy — the avoidance of a nested cross-film pressure iteration — positioning the model between the one-dimensional reductions of [21] and the full CFD treatments of [39, 44].</w:t>
-      </w:r>
-    </w:p>
-    <w:p/>
-    <w:p>
-      <w:pPr>
-        <w:pStyle w:val="Heading2"/>
-      </w:pPr>
-      <w:r>
-        <w:t xml:space="preserve">2.7 Synthesis and research gap</w:t>
-      </w:r>
-    </w:p>
-    <w:p/>
-    <w:p>
-      <w:pPr/>
-      <w:r>
-        <w:t xml:space="preserve">The literature offers mature but largely separate treatments of power-law rheology [1, 13, 22], thermal effects [5, 6, 20], elastic deformation [10, 33, 34], and mass-conserving cavitation [27, 28, 30]. Scarce is a single semi-analytical framework integrating all four within the efficient delta-profile closure, so that the flow index and eccentricity ratio can be studied without discarding elastic realism or mass conservation. The present TEHD model fills this gap.</w:t>
-      </w:r>
-    </w:p>
-    <w:p/>
-    <w:p/>
-    <w:p/>
-    <w:p>
-      <w:pPr>
-        <w:pStyle w:val="Heading1"/>
-      </w:pPr>
-      <w:r>
-        <w:t xml:space="preserve">3. Mathematical Modelling and Governing Equations</w:t>
-      </w:r>
-    </w:p>
-    <w:p/>
-    <w:p>
-      <w:pPr>
-        <w:pStyle w:val="Heading2"/>
-      </w:pPr>
-      <w:r>
-        <w:t xml:space="preserve">3.1 Geometry, assumptions, and field equations</w:t>
+        <w:t xml:space="preserve">2.1 Geometry, assumptions, and field equations</w:t>
       </w:r>
     </w:p>
     <w:p/>
@@ -764,7 +648,7 @@
         <w:pStyle w:val="Heading2"/>
       </w:pPr>
       <w:r>
-        <w:t xml:space="preserve">3.2 Power-law rheology with thermo-piezo-viscous consistency</w:t>
+        <w:t xml:space="preserve">2.2 Power-law rheology with thermo-piezo-viscous consistency</w:t>
       </w:r>
     </w:p>
     <w:p/>
@@ -1213,7 +1097,7 @@
         <w:pStyle w:val="Heading2"/>
       </w:pPr>
       <w:r>
-        <w:t xml:space="preserve">3.3 Film thickness with elastic deformation</w:t>
+        <w:t xml:space="preserve">2.3 Film thickness with elastic deformation</w:t>
       </w:r>
     </w:p>
     <w:p/>
@@ -2174,7 +2058,7 @@
         <w:pStyle w:val="Heading2"/>
       </w:pPr>
       <w:r>
-        <w:t xml:space="preserve">3.4 Delta-profile velocity field</w:t>
+        <w:t xml:space="preserve">2.4 Delta-profile velocity field</w:t>
       </w:r>
     </w:p>
     <w:p/>
@@ -4146,7 +4030,7 @@
         <w:pStyle w:val="Heading2"/>
       </w:pPr>
       <w:r>
-        <w:t xml:space="preserve">3.5 Flow rate and the pressure-gradient relations</w:t>
+        <w:t xml:space="preserve">2.5 Flow rate and the pressure-gradient relations</w:t>
       </w:r>
     </w:p>
     <w:p/>
@@ -5205,7 +5089,7 @@
         <w:pStyle w:val="Heading2"/>
       </w:pPr>
       <w:r>
-        <w:t xml:space="preserve">3.6 Generalised two-dimensional power-law Reynolds equation</w:t>
+        <w:t xml:space="preserve">2.6 Generalised two-dimensional power-law Reynolds equation</w:t>
       </w:r>
     </w:p>
     <w:p/>
@@ -5940,7 +5824,7 @@
         <w:pStyle w:val="Heading2"/>
       </w:pPr>
       <w:r>
-        <w:t xml:space="preserve">3.7 Mass-conserving cavitation (JFO / Elrod–Adams)</w:t>
+        <w:t xml:space="preserve">2.7 Mass-conserving cavitation (JFO / Elrod–Adams)</w:t>
       </w:r>
     </w:p>
     <w:p/>
@@ -6757,7 +6641,7 @@
         <w:pStyle w:val="Heading2"/>
       </w:pPr>
       <w:r>
-        <w:t xml:space="preserve">3.8 Energy equation and conjugate heat transfer</w:t>
+        <w:t xml:space="preserve">2.8 Energy equation and conjugate heat transfer</w:t>
       </w:r>
     </w:p>
     <w:p/>
@@ -8470,7 +8354,7 @@
         <w:pStyle w:val="Heading2"/>
       </w:pPr>
       <w:r>
-        <w:t xml:space="preserve">3.9 Non-dimensionalisation</w:t>
+        <w:t xml:space="preserve">2.9 Non-dimensionalisation</w:t>
       </w:r>
     </w:p>
     <w:p/>
@@ -9329,7 +9213,7 @@
         <w:pStyle w:val="Heading2"/>
       </w:pPr>
       <w:r>
-        <w:t xml:space="preserve">3.10 Load, attitude angle, and performance</w:t>
+        <w:t xml:space="preserve">2.10 Load, attitude angle, and performance</w:t>
       </w:r>
     </w:p>
     <w:p/>
@@ -9857,7 +9741,7 @@
         <w:pStyle w:val="Heading1"/>
       </w:pPr>
       <w:r>
-        <w:t xml:space="preserve">4. Numerical Solution Methodology</w:t>
+        <w:t xml:space="preserve">3. Numerical Solution Methodology</w:t>
       </w:r>
     </w:p>
     <w:p/>
@@ -10339,7 +10223,7 @@
         <w:pStyle w:val="Heading1"/>
       </w:pPr>
       <w:r>
-        <w:t xml:space="preserve">5. Validation</w:t>
+        <w:t xml:space="preserve">4. Validation</w:t>
       </w:r>
     </w:p>
     <w:p/>
@@ -11136,7 +11020,7 @@
         </m:r>
       </m:oMath>
       <w:r>
-        <w:t xml:space="preserve"> rises, while the TEHD prediction, relieved by elastic deflection, tracks the measured values. The agreement across both benchmarks, summarised in Table 2, is substantially better for the TEHD model than for the rigid, full-film treatment. The residual discrepancy between the TEHD prediction and experiment (of the order of 5%) is attributable to the simplified Winkler compliance and the steady-state thermal assumption, both of which are discussed in Section 6.8; it is well within the scatter typically reported for instrumented-bearing measurements under severe operating conditions [11]. Importantly, the two benchmarks test complementary aspects of the model: Figure 2 isolates the shape of the pressure field, which is governed jointly by elastic relief and cavitation clipping, whereas Figure 3 isolates the load-scaling with eccentricity, which is dominated by elastic relief. That a single parameter set reproduces both lends confidence that the governing mechanisms, and not merely a calibration, are responsible for the improved agreement.</w:t>
+        <w:t xml:space="preserve"> rises, while the TEHD prediction, relieved by elastic deflection, tracks the measured values. The agreement across both benchmarks, summarised in Table 2, is substantially better for the TEHD model than for the rigid, full-film treatment. The residual discrepancy between the TEHD prediction and experiment (of the order of 5%) is attributable to the simplified Winkler compliance and the steady-state thermal assumption, both of which are discussed in Section 5.8; it is well within the scatter typically reported for instrumented-bearing measurements under severe operating conditions [11]. Importantly, the two benchmarks test complementary aspects of the model: Figure 2 isolates the shape of the pressure field, which is governed jointly by elastic relief and cavitation clipping, whereas Figure 3 isolates the load-scaling with eccentricity, which is dominated by elastic relief. That a single parameter set reproduces both lends confidence that the governing mechanisms, and not merely a calibration, are responsible for the improved agreement.</w:t>
       </w:r>
     </w:p>
     <w:p/>
@@ -11670,7 +11554,7 @@
         <w:pStyle w:val="Heading1"/>
       </w:pPr>
       <w:r>
-        <w:t xml:space="preserve">6. Results and Discussion</w:t>
+        <w:t xml:space="preserve">5. Results and Discussion</w:t>
       </w:r>
     </w:p>
     <w:p/>
@@ -11679,7 +11563,7 @@
         <w:pStyle w:val="Heading2"/>
       </w:pPr>
       <w:r>
-        <w:t xml:space="preserve">6.1 Pressure distribution</w:t>
+        <w:t xml:space="preserve">5.1 Pressure distribution</w:t>
       </w:r>
     </w:p>
     <w:p/>
@@ -11739,7 +11623,7 @@
         <w:pStyle w:val="Heading2"/>
       </w:pPr>
       <w:r>
-        <w:t xml:space="preserve">6.2 Effect of the power-law index</w:t>
+        <w:t xml:space="preserve">5.2 Effect of the power-law index</w:t>
       </w:r>
     </w:p>
     <w:p/>
@@ -11785,7 +11669,7 @@
         </m:r>
       </m:oMath>
       <w:r>
-        <w:t xml:space="preserve">: Table 3 shows the load deficit relative to the rigid model growing from 12% for the strongly pseudo-plastic fluid to 17% for the dilatant fluid. This is a direct consequence of the pressure–deflection feedback described in Section 6.1: the dilatant fluid produces the sharpest, highest peak and therefore suffers the largest elastic relief. The result refines the rigid-model conclusion of [20] in a design-relevant way — although dilatant lubricants remain advantageous for load capacity, a rigid analysis overstates their advantage, a caution also implicit in the compliant-liner results of Linjamaa et al. [10] and in the finite-volume THD study of [37], where temperature-dependent consistency was likewise found to erode the load gain predicted by iso-viscous power-law models.</w:t>
+        <w:t xml:space="preserve">: Table 3 shows the load deficit relative to the rigid model growing from 12% for the strongly pseudo-plastic fluid to 17% for the dilatant fluid. This is a direct consequence of the pressure–deflection feedback described in Section 5.1: the dilatant fluid produces the sharpest, highest peak and therefore suffers the largest elastic relief. The result refines the rigid-model conclusion of [20] in a design-relevant way — although dilatant lubricants remain advantageous for load capacity, a rigid analysis overstates their advantage, a caution also implicit in the compliant-liner results of Linjamaa et al. [10] and in the finite-volume THD study of [37], where temperature-dependent consistency was likewise found to erode the load gain predicted by iso-viscous power-law models.</w:t>
       </w:r>
     </w:p>
     <w:p/>
@@ -12271,7 +12155,7 @@
         <w:pStyle w:val="Heading2"/>
       </w:pPr>
       <w:r>
-        <w:t xml:space="preserve">6.3 Effect of the eccentricity ratio</w:t>
+        <w:t xml:space="preserve">5.3 Effect of the eccentricity ratio</w:t>
       </w:r>
     </w:p>
     <w:p/>
@@ -12940,7 +12824,7 @@
         <w:pStyle w:val="Heading2"/>
       </w:pPr>
       <w:r>
-        <w:t xml:space="preserve">6.4 Temperature distribution</w:t>
+        <w:t xml:space="preserve">5.4 Temperature distribution</w:t>
       </w:r>
     </w:p>
     <w:p/>
@@ -13163,7 +13047,7 @@
         <w:pStyle w:val="Heading2"/>
       </w:pPr>
       <w:r>
-        <w:t xml:space="preserve">6.5 Load, friction, and leakage</w:t>
+        <w:t xml:space="preserve">5.5 Load, friction, and leakage</w:t>
       </w:r>
     </w:p>
     <w:p/>
@@ -13277,7 +13161,7 @@
         <w:pStyle w:val="Heading2"/>
       </w:pPr>
       <w:r>
-        <w:t xml:space="preserve">6.6 Film thickness and cavitation extent</w:t>
+        <w:t xml:space="preserve">5.6 Film thickness and cavitation extent</w:t>
       </w:r>
     </w:p>
     <w:p/>
@@ -13378,7 +13262,7 @@
         <w:pStyle w:val="Heading2"/>
       </w:pPr>
       <w:r>
-        <w:t xml:space="preserve">6.7 Interaction between elasticity and cavitation</w:t>
+        <w:t xml:space="preserve">5.7 Interaction between elasticity and cavitation</w:t>
       </w:r>
     </w:p>
     <w:p/>
@@ -13408,7 +13292,7 @@
         </m:sSub>
       </m:oMath>
       <w:r>
-        <w:t xml:space="preserve"> removes the tensile load that would pull the surface inward, so the deflection of Equation (11) is itself cavitation-dependent. This mutual dependence is resolved by the staggered iteration of Section 4, which required under-relaxation of both the film update and the switch sweep to prevent the rupture boundary oscillating between cells — a sensitivity also reported for mass-conserving EHD [33] and FSI–cavitation CFD [39]. It confirms that a lightly coupled treatment which truncates pressure after an independent elastic solve can misplace the rupture boundary and misestimate the load; the fully coupled scheme adopted here avoids that error.</w:t>
+        <w:t xml:space="preserve"> removes the tensile load that would pull the surface inward, so the deflection of Equation (11) is itself cavitation-dependent. This mutual dependence is resolved by the staggered iteration of Section 3, which required under-relaxation of both the film update and the switch sweep to prevent the rupture boundary oscillating between cells — a sensitivity also reported for mass-conserving EHD [33] and FSI–cavitation CFD [39]. It confirms that a lightly coupled treatment which truncates pressure after an independent elastic solve can misplace the rupture boundary and misestimate the load; the fully coupled scheme adopted here avoids that error.</w:t>
       </w:r>
     </w:p>
     <w:p/>
@@ -13417,7 +13301,7 @@
         <w:pStyle w:val="Heading2"/>
       </w:pPr>
       <w:r>
-        <w:t xml:space="preserve">6.8 Limitations and scope of validity</w:t>
+        <w:t xml:space="preserve">5.8 Limitations and scope of validity</w:t>
       </w:r>
     </w:p>
     <w:p/>
@@ -13433,7 +13317,7 @@
         <w:pStyle w:val="Heading2"/>
       </w:pPr>
       <w:r>
-        <w:t xml:space="preserve">6.9 Comparison with the broader literature and practical significance</w:t>
+        <w:t xml:space="preserve">5.9 Comparison with the broader literature and practical significance</w:t>
       </w:r>
     </w:p>
     <w:p/>
@@ -13451,7 +13335,7 @@
         <w:pStyle w:val="Heading1"/>
       </w:pPr>
       <w:r>
-        <w:t xml:space="preserve">7. Conclusions</w:t>
+        <w:t xml:space="preserve">6. Conclusions</w:t>
       </w:r>
     </w:p>
     <w:p/>

</xml_diff>

<commit_message>
Remove citations from abstract and conclusions; renumber all references into strict serial (first-appearance) order
</commit_message>
<xml_diff>
--- a/Research_Article_TEHD_Journal_Bearing.docx
+++ b/Research_Article_TEHD_Journal_Bearing.docx
@@ -24,7 +24,7 @@
     <w:p>
       <w:pPr/>
       <w:r>
-        <w:t xml:space="preserve">The thermo-hydrodynamic (THD) analysis of journal bearings operating with non-Newtonian power-law lubricants has advanced considerably through semi-analytical treatments such as the delta-profile formulation, in which the location of the zero-velocity-gradient surface is linearised to permit closed-form evaluation of the velocity, flow, and shear-stress integrals [20]. However, two idealisations continue to limit the physical fidelity of such models: the bearing surfaces are assumed rigid, and the lubricant film is assumed continuous so that sub-ambient (tensile) pressures are admitted in the divergent clearance. The present work removes both idealisations by developing a thermo-elasto-hydrodynamic (TEHD) model that couples (i) the elastic deformation of the bush and liner through a compliance (influence-coefficient) film-thickness equation, and (ii) a mass-conserving Jakobsson–Floberg–Olsson (JFO) cavitation treatment implemented through the Elrod–Adams switch-function algorithm, while preserving the power-law rheology with a thermo-piezo-viscous consistency and the delta-profile cross-film closure. The coupled Reynolds, energy (with conjugate conduction into the solids), compliance, and cavitation relations are solved in a staggered, under-relaxed iterative loop, and the model reduces exactly to the rigid, full-film THD baseline when the compliance vanishes and the cavitation pressure tends to minus infinity, providing a stringent verification case. Validation against two independent benchmarks shows that the TEHD prediction of the circumferential pressure distribution and the peak-pressure–eccentricity relationship agree with experimental and prior numerical data markedly better than the rigid, full-film prediction. The results demonstrate that elastic compliance reduces and broadens the pressure peak, mass-conserving cavitation bounds the pressure field and fixes physically consistent rupture and reformation boundaries, and the predicted load capacity is lower than the rigid estimate by an amount that grows with eccentricity ratio and the elasticity number. The findings reconcile several apparently contradictory trends reported in the literature for Newtonian and non-Newtonian lubricants.</w:t>
+        <w:t xml:space="preserve">The thermo-hydrodynamic (THD) analysis of journal bearings operating with non-Newtonian power-law lubricants has advanced considerably through semi-analytical treatments such as the delta-profile formulation, in which the location of the zero-velocity-gradient surface is linearised to permit closed-form evaluation of the velocity, flow, and shear-stress integrals. However, two idealisations continue to limit the physical fidelity of such models: the bearing surfaces are assumed rigid, and the lubricant film is assumed continuous so that sub-ambient (tensile) pressures are admitted in the divergent clearance. The present work removes both idealisations by developing a thermo-elasto-hydrodynamic (TEHD) model that couples (i) the elastic deformation of the bush and liner through a compliance (influence-coefficient) film-thickness equation, and (ii) a mass-conserving Jakobsson–Floberg–Olsson (JFO) cavitation treatment implemented through the Elrod–Adams switch-function algorithm, while preserving the power-law rheology with a thermo-piezo-viscous consistency and the delta-profile cross-film closure. The coupled Reynolds, energy (with conjugate conduction into the solids), compliance, and cavitation relations are solved in a staggered, under-relaxed iterative loop, and the model reduces exactly to the rigid, full-film THD baseline when the compliance vanishes and the cavitation pressure tends to minus infinity, providing a stringent verification case. Validation against two independent benchmarks shows that the TEHD prediction of the circumferential pressure distribution and the peak-pressure–eccentricity relationship agree with experimental and prior numerical data markedly better than the rigid, full-film prediction. The results demonstrate that elastic compliance reduces and broadens the pressure peak, mass-conserving cavitation bounds the pressure field and fixes physically consistent rupture and reformation boundaries, and the predicted load capacity is lower than the rigid estimate by an amount that grows with eccentricity ratio and the elasticity number. The findings reconcile several apparently contradictory trends reported in the literature for Newtonian and non-Newtonian lubricants.</w:t>
       </w:r>
     </w:p>
     <w:p/>
@@ -55,42 +55,42 @@
     <w:p>
       <w:pPr/>
       <w:r>
-        <w:t xml:space="preserve">Hydrodynamic journal bearings remain the dominant load-carrying element in rotating machinery, supporting turbine, compressor, pump, engine, and generator shafts through a converging lubricant wedge that generates pressure without solid contact [18, 31, 51]. The classical Reynolds equation [23], later generalised by Dowson [32], describes this pressure field for a thin, iso-viscous, Newtonian film between rigid surfaces. For modern machine elements under high specific load, elevated speed, and chemically complex lubricants, each of these assumptions is difficult to justify, which has driven decades of effort toward non-Newtonian rheology, thermal coupling, elastic deformation, and cavitation.</w:t>
-      </w:r>
-    </w:p>
-    <w:p/>
-    <w:p>
-      <w:pPr/>
-      <w:r>
-        <w:t xml:space="preserve">Practical lubricants — additive-laden mineral oils, greases, polymer-thickened oils, emulsions, and bio-lubricants — deviate from the linear stress–strain-rate law and are most often represented by the Ostwald–de Waele power-law model [1, 12, 13]. Oliver [1] showed experimentally that polymer thickening enhances load capacity, and Dien and Elrod [13] gave the subject a firm footing with a generalised Reynolds equation; the power-law description is favoured for its two-parameter economy, a consistency and a flow-behaviour index distinguishing pseudo-plastic, Newtonian, and dilatant behaviour [8, 17, 19, 22]. Experimental and integral-transform studies [2, 3] mapped the resulting pressure field, while recent finite-volume [37], two-lobe [40], and grooved-rubber [41] analyses confirm that the flow index is a first-order design parameter, with shear-thickening fluids generally outperforming shear-thinning ones.</w:t>
-      </w:r>
-    </w:p>
-    <w:p/>
-    <w:p>
-      <w:pPr/>
-      <w:r>
-        <w:t xml:space="preserve">Because viscous dissipation both heats the film and, through the temperature dependence of consistency, feeds back on pressure, non-Newtonian analysis is inseparable from thermal analysis. Ma and Taylor [5] measured significant circumferential and axial temperature variation, and Sun et al. [6] reported the influence of temperature on load, leakage, and friction in misaligned rough bearings. Simplified one-dimensional models [21] capture the leading-order rise but omit heat conducted into the solids; conjugate thermo-hydrodynamic (THD) treatments that solve the solid-conduction field with the film energy equation predict metal temperatures between the adiabatic and isothermal limits and are more realistic [14, 36]. Peng and Khonsari [15] developed a THD analysis of compliant foil bearings, and CFD studies confirm conjugate effects are essential at elevated Reynolds number [39, 44]. Among semi-analytical methods — valued for the physical insight their closed forms provide [4, 49, 50] — Sekhar et al. [20] introduced a delta-profile concept that locates the zero-velocity-gradient surface across the film, reducing the coupled Reynolds and energy equations to a system integrated with a Runge–Kutta–Fehlberg scheme, and validated it against two-axial-groove bearing data [11].</w:t>
-      </w:r>
-    </w:p>
-    <w:p/>
-    <w:p>
-      <w:pPr/>
-      <w:r>
-        <w:t xml:space="preserve">Two idealisations nonetheless persist in the delta-profile model and comparable treatments. First, the surfaces are assumed rigid, whereas hydrodynamic pressure elastically deflects the bush and liner, enlarging the clearance, lowering and spreading the pressure peak, and raising the minimum film thickness — effects pronounced for compliant liners and at high load. Oh and Goenka [34] and Boedo and Booker [33] quantified these elastohydrodynamic trends, Fantino and Frêne [35] treated combined thermal–elastic distortion, and Linjamaa et al. [10] modelled hybrid-bearing deformation; the influence-coefficient (compliance-matrix) method is the standard device for incorporating deflection economically [33, 34]. Second, the full-film assumption admits sub-ambient pressures in the divergent clearance, whereas real films rupture and cavitate near the cavitation pressure [16, 24]. Truncating negative pressures violates mass conservation; the Jakobsson–Floberg–Olsson theory [25, 26] remedies this with a fractional-film-content variable, which Elrod and Adams [27, 28] cast as a switch-function algorithm, Vijayaraghavan and Keith [29] refined, and Bayada and Chambat [30] placed on a rigorous footing. Mass conservation materially changes the predicted pressure and load relative to non-conservative truncation [39].</w:t>
-      </w:r>
-    </w:p>
-    <w:p/>
-    <w:p>
-      <w:pPr/>
-      <w:r>
-        <w:t xml:space="preserve">A parallel stream pursues performance through lubricant and surface engineering — nanoparticle additives that raise viscosity and load capacity [38, 45, 46, 47], experimental–CFD studies of composite bearings [48], and surface texturing or topology optimisation that raises minimum film thickness and lowers friction [42, 43]. Stochastic and experimental investigations further characterise surface roughness and severe-condition behaviour [7, 9, 11]. Such refinements invariably rest on accurate thermal, elastic, and cavitation predictions, underscoring the need for an integrated framework.</w:t>
-      </w:r>
-    </w:p>
-    <w:p/>
-    <w:p>
-      <w:pPr/>
-      <w:r>
-        <w:t xml:space="preserve">The literature thus offers mature but largely separate treatments of power-law rheology [1, 13, 22], thermal effects [5, 6, 20], elastic deformation [10, 33, 34], and mass-conserving cavitation [27, 28, 30]. Scarce is a single semi-analytical framework that integrates all four within the efficient delta-profile closure, so that the flow index and eccentricity ratio can be studied without discarding either elastic realism or mass conservation. The present work fills this gap by formulating a thermo-elasto-hydrodynamic (TEHD) model that augments the power-law delta-profile THD framework with elastic deformation and mass-conserving cavitation. Its objectives are: (a) to derive the coupled governing equations — a generalised power-law Reynolds equation, a compliance film-thickness relation, a JFO/Elrod–Adams cavitation formulation, and a conjugate energy equation; (b) to establish a staggered algorithm that recovers the rigid, full-film THD solution as a limiting case; (c) to validate the model against independent experimental and numerical benchmarks; and (d) to analyse, against the prior literature, how elasticity and cavitation modify the pressure, temperature, and load for Newtonian and non-Newtonian lubricants.</w:t>
+        <w:t xml:space="preserve">Hydrodynamic journal bearings remain the dominant load-carrying element in rotating machinery, supporting turbine, compressor, pump, engine, and generator shafts through a converging lubricant wedge that generates pressure without solid contact [1, 2, 3]. The classical Reynolds equation [4], later generalised by Dowson [5], describes this pressure field for a thin, iso-viscous, Newtonian film between rigid surfaces. For modern machine elements under high specific load, elevated speed, and chemically complex lubricants, each of these assumptions is difficult to justify, which has driven decades of effort toward non-Newtonian rheology, thermal coupling, elastic deformation, and cavitation.</w:t>
+      </w:r>
+    </w:p>
+    <w:p/>
+    <w:p>
+      <w:pPr/>
+      <w:r>
+        <w:t xml:space="preserve">Practical lubricants — additive-laden mineral oils, greases, polymer-thickened oils, emulsions, and bio-lubricants — deviate from the linear stress–strain-rate law and are most often represented by the Ostwald–de Waele power-law model [6, 7, 8]. Oliver [6] showed experimentally that polymer thickening enhances load capacity, and Dien and Elrod [8] gave the subject a firm footing with a generalised Reynolds equation; the power-law description is favoured for its two-parameter economy, a consistency and a flow-behaviour index distinguishing pseudo-plastic, Newtonian, and dilatant behaviour [9, 10, 11, 12]. Experimental and integral-transform studies [13, 14] mapped the resulting pressure field, while recent finite-volume [15], two-lobe [16], and grooved-rubber [17] analyses confirm that the flow index is a first-order design parameter, with shear-thickening fluids generally outperforming shear-thinning ones.</w:t>
+      </w:r>
+    </w:p>
+    <w:p/>
+    <w:p>
+      <w:pPr/>
+      <w:r>
+        <w:t xml:space="preserve">Because viscous dissipation both heats the film and, through the temperature dependence of consistency, feeds back on pressure, non-Newtonian analysis is inseparable from thermal analysis. Ma and Taylor [18] measured significant circumferential and axial temperature variation, and Sun et al. [19] reported the influence of temperature on load, leakage, and friction in misaligned rough bearings. Simplified one-dimensional models [20] capture the leading-order rise but omit heat conducted into the solids; conjugate thermo-hydrodynamic (THD) treatments that solve the solid-conduction field with the film energy equation predict metal temperatures between the adiabatic and isothermal limits and are more realistic [21, 22]. Peng and Khonsari [23] developed a THD analysis of compliant foil bearings, and CFD studies confirm conjugate effects are essential at elevated Reynolds number [24, 25]. Among semi-analytical methods — valued for the physical insight their closed forms provide [26, 27, 28] — Sekhar et al. [29] introduced a delta-profile concept that locates the zero-velocity-gradient surface across the film, reducing the coupled Reynolds and energy equations to a system integrated with a Runge–Kutta–Fehlberg scheme, and validated it against two-axial-groove bearing data [30].</w:t>
+      </w:r>
+    </w:p>
+    <w:p/>
+    <w:p>
+      <w:pPr/>
+      <w:r>
+        <w:t xml:space="preserve">Two idealisations nonetheless persist in the delta-profile model and comparable treatments. First, the surfaces are assumed rigid, whereas hydrodynamic pressure elastically deflects the bush and liner, enlarging the clearance, lowering and spreading the pressure peak, and raising the minimum film thickness — effects pronounced for compliant liners and at high load. Oh and Goenka [31] and Boedo and Booker [32] quantified these elastohydrodynamic trends, Fantino and Frêne [33] treated combined thermal–elastic distortion, and Linjamaa et al. [34] modelled hybrid-bearing deformation; the influence-coefficient (compliance-matrix) method is the standard device for incorporating deflection economically [31, 32]. Second, the full-film assumption admits sub-ambient pressures in the divergent clearance, whereas real films rupture and cavitate near the cavitation pressure [35, 36]. Truncating negative pressures violates mass conservation; the Jakobsson–Floberg–Olsson theory [37, 38] remedies this with a fractional-film-content variable, which Elrod and Adams [39, 40] cast as a switch-function algorithm, Vijayaraghavan and Keith [41] refined, and Bayada and Chambat [42] placed on a rigorous footing. Mass conservation materially changes the predicted pressure and load relative to non-conservative truncation [24].</w:t>
+      </w:r>
+    </w:p>
+    <w:p/>
+    <w:p>
+      <w:pPr/>
+      <w:r>
+        <w:t xml:space="preserve">A parallel stream pursues performance through lubricant and surface engineering — nanoparticle additives that raise viscosity and load capacity [43, 44, 45, 46], experimental–CFD studies of composite bearings [47], and surface texturing or topology optimisation that raises minimum film thickness and lowers friction [48, 49]. Stochastic and experimental investigations further characterise surface roughness and severe-condition behaviour [30, 50, 51]. Such refinements invariably rest on accurate thermal, elastic, and cavitation predictions, underscoring the need for an integrated framework.</w:t>
+      </w:r>
+    </w:p>
+    <w:p/>
+    <w:p>
+      <w:pPr/>
+      <w:r>
+        <w:t xml:space="preserve">The literature thus offers mature but largely separate treatments of power-law rheology [6, 8, 12], thermal effects [18, 19, 29], elastic deformation [31, 32, 34], and mass-conserving cavitation [39, 40, 42]. Scarce is a single semi-analytical framework that integrates all four within the efficient delta-profile closure, so that the flow index and eccentricity ratio can be studied without discarding either elastic realism or mass conservation. The present work fills this gap by formulating a thermo-elasto-hydrodynamic (TEHD) model that augments the power-law delta-profile THD framework with elastic deformation and mass-conserving cavitation. Its objectives are: (a) to derive the coupled governing equations — a generalised power-law Reynolds equation, a compliance film-thickness relation, a JFO/Elrod–Adams cavitation formulation, and a conjugate energy equation; (b) to establish a staggered algorithm that recovers the rigid, full-film THD solution as a limiting case; (c) to validate the model against independent experimental and numerical benchmarks; and (d) to analyse, against the prior literature, how elasticity and cavitation modify the pressure, temperature, and load for Newtonian and non-Newtonian lubricants.</w:t>
       </w:r>
     </w:p>
     <w:p/>
@@ -885,7 +885,7 @@
         </m:r>
       </m:oMath>
       <w:r>
-        <w:t xml:space="preserve"> dilatant). Following the base model [20], the consistency </w:t>
+        <w:t xml:space="preserve"> dilatant). Following the base model [29], the consistency </w:t>
       </w:r>
       <m:oMath>
         <m:r>
@@ -2065,7 +2065,7 @@
     <w:p>
       <w:pPr/>
       <w:r>
-        <w:t xml:space="preserve">The delta profile [20] locates the surface </w:t>
+        <w:t xml:space="preserve">The delta profile [29] locates the surface </w:t>
       </w:r>
       <m:oMath>
         <m:r>
@@ -5831,7 +5831,7 @@
     <w:p>
       <w:pPr/>
       <w:r>
-        <w:t xml:space="preserve">To conserve mass across rupture and reformation, the JFO framework [25, 26] is implemented through the Elrod–Adams switch function [27, 28]. A single universal variable </w:t>
+        <w:t xml:space="preserve">To conserve mass across rupture and reformation, the JFO framework [37, 38] is implemented through the Elrod–Adams switch function [39, 40]. A single universal variable </w:t>
       </w:r>
       <m:oMath>
         <m:r>
@@ -8361,7 +8361,7 @@
     <w:p>
       <w:pPr/>
       <w:r>
-        <w:t xml:space="preserve">Following [20], the dimensionless variables are</w:t>
+        <w:t xml:space="preserve">Following [29], the dimensionless variables are</w:t>
       </w:r>
     </w:p>
     <w:p/>
@@ -10196,7 +10196,7 @@
     <w:p>
       <w:pPr/>
       <w:r>
-        <w:t xml:space="preserve">Within step 2 the delta-profile closed forms (14)–(20) and (23)–(24) are used to evaluate the pressure-flow coefficients (26)–(28) directly, avoiding a nested cross-film pressure iteration — the computational economy inherited from the base model [20]. Grid-independence was confirmed by refining the </w:t>
+        <w:t xml:space="preserve">Within step 2 the delta-profile closed forms (14)–(20) and (23)–(24) are used to evaluate the pressure-flow coefficients (26)–(28) directly, avoiding a nested cross-film pressure iteration — the computational economy inherited from the base model [29]. Grid-independence was confirmed by refining the </w:t>
       </w:r>
       <m:oMath>
         <m:r>
@@ -10994,7 +10994,7 @@
     <w:p>
       <w:pPr/>
       <w:r>
-        <w:t xml:space="preserve">First, with the compliance set to zero and the cavitation pressure driven to minus infinity, the model reproduced the circumferential pressure and mean-temperature distributions of the rigid, full-film base model [20] to within the discretisation error (load difference &lt; 0.5%), confirming correct limiting-case recovery. Second, the full TEHD model was compared with the experimental two-axial-groove bearing data of Chatterton et al. [11] and with the rigid THD prediction. </w:t>
+        <w:t xml:space="preserve">First, with the compliance set to zero and the cavitation pressure driven to minus infinity, the model reproduced the circumferential pressure and mean-temperature distributions of the rigid, full-film base model [29] to within the discretisation error (load difference &lt; 0.5%), confirming correct limiting-case recovery. Second, the full TEHD model was compared with the experimental two-axial-groove bearing data of Chatterton et al. [30] and with the rigid THD prediction. </w:t>
       </w:r>
       <w:r>
         <w:rPr>
@@ -11020,7 +11020,7 @@
         </m:r>
       </m:oMath>
       <w:r>
-        <w:t xml:space="preserve"> rises, while the TEHD prediction, relieved by elastic deflection, tracks the measured values. The agreement across both benchmarks, summarised in Table 2, is substantially better for the TEHD model than for the rigid, full-film treatment. The residual discrepancy between the TEHD prediction and experiment (of the order of 5%) is attributable to the simplified Winkler compliance and the steady-state thermal assumption, both of which are discussed in Section 5.8; it is well within the scatter typically reported for instrumented-bearing measurements under severe operating conditions [11]. Importantly, the two benchmarks test complementary aspects of the model: Figure 2 isolates the shape of the pressure field, which is governed jointly by elastic relief and cavitation clipping, whereas Figure 3 isolates the load-scaling with eccentricity, which is dominated by elastic relief. That a single parameter set reproduces both lends confidence that the governing mechanisms, and not merely a calibration, are responsible for the improved agreement.</w:t>
+        <w:t xml:space="preserve"> rises, while the TEHD prediction, relieved by elastic deflection, tracks the measured values. The agreement across both benchmarks, summarised in Table 2, is substantially better for the TEHD model than for the rigid, full-film treatment. The residual discrepancy between the TEHD prediction and experiment (of the order of 5%) is attributable to the simplified Winkler compliance and the steady-state thermal assumption, both of which are discussed in Section 5.8; it is well within the scatter typically reported for instrumented-bearing measurements under severe operating conditions [30]. Importantly, the two benchmarks test complementary aspects of the model: Figure 2 isolates the shape of the pressure field, which is governed jointly by elastic relief and cavitation clipping, whereas Figure 3 isolates the load-scaling with eccentricity, which is dominated by elastic relief. That a single parameter set reproduces both lends confidence that the governing mechanisms, and not merely a calibration, are responsible for the improved agreement.</w:t>
       </w:r>
     </w:p>
     <w:p/>
@@ -11058,7 +11058,7 @@
         </m:r>
       </m:oMath>
       <w:r>
-        <w:t xml:space="preserve">: present TEHD model, rigid full-film THD model [20], and experimental data [11]. *(see `tehd_figures/Fig2_pressure_validation.png`)*</w:t>
+        <w:t xml:space="preserve">: present TEHD model, rigid full-film THD model [29], and experimental data [30]. *(see `tehd_figures/Fig2_pressure_validation.png`)*</w:t>
       </w:r>
     </w:p>
     <w:p>
@@ -11142,7 +11142,7 @@
         </m:r>
       </m:oMath>
       <w:r>
-        <w:t xml:space="preserve">: present TEHD model, rigid THD model [20], and experimental data [11]. *(see `tehd_figures/Fig3_peakpressure_validation.png`)*</w:t>
+        <w:t xml:space="preserve">: present TEHD model, rigid THD model [29], and experimental data [30]. *(see `tehd_figures/Fig3_peakpressure_validation.png`)*</w:t>
       </w:r>
     </w:p>
     <w:p>
@@ -11245,7 +11245,7 @@
               <w:rPr>
                 <w:b/>
               </w:rPr>
-              <w:t xml:space="preserve">Rigid THD [20]</w:t>
+              <w:t xml:space="preserve">Rigid THD [29]</w:t>
             </w:r>
           </w:p>
         </w:tc>
@@ -11279,7 +11279,7 @@
               <w:rPr>
                 <w:b/>
               </w:rPr>
-              <w:t xml:space="preserve">Experiment [11]</w:t>
+              <w:t xml:space="preserve">Experiment [30]</w:t>
             </w:r>
           </w:p>
         </w:tc>
@@ -11570,7 +11570,7 @@
     <w:p>
       <w:pPr/>
       <w:r>
-        <w:t xml:space="preserve">The TEHD coupling changes the pressure field in two physically distinct ways, both visible in Figure 2. Elastic compliance redistributes the load: as the surface deflects outward in the high-pressure zone, the local clearance increases and the sharp pressure peak characteristic of the rigid model [20] is reduced in magnitude and broadened in the circumferential direction. For the reference case (ε = 0.66, n = 1.0, Table 2) the peak dimensionless pressure falls from 0.71 in the rigid model to 0.57 in the TEHD model — a reduction of about 20% — while the angular width of the positive-pressure lobe increases by roughly one-third. This behaviour is quantitatively consistent with the elastohydrodynamic journal-bearing analyses of Oh and Goenka [34] and Boedo and Booker [33], which reported peak-pressure reductions of the order of 15–25% for compliant conformal contacts, and with the hybrid-bearing deformation study of Linjamaa et al. [10]. Physically, the deflection acts as a negative feedback on the pressure: wherever the pressure is highest the surface yields most, which locally opens the gap and relaxes the pressure gradient of Equation (25), so the peak cannot grow without bound as it does in the rigid solution.</w:t>
+        <w:t xml:space="preserve">The TEHD coupling changes the pressure field in two physically distinct ways, both visible in Figure 2. Elastic compliance redistributes the load: as the surface deflects outward in the high-pressure zone, the local clearance increases and the sharp pressure peak characteristic of the rigid model [29] is reduced in magnitude and broadened in the circumferential direction. For the reference case (ε = 0.66, n = 1.0, Table 2) the peak dimensionless pressure falls from 0.71 in the rigid model to 0.57 in the TEHD model — a reduction of about 20% — while the angular width of the positive-pressure lobe increases by roughly one-third. This behaviour is quantitatively consistent with the elastohydrodynamic journal-bearing analyses of Oh and Goenka [31] and Boedo and Booker [32], which reported peak-pressure reductions of the order of 15–25% for compliant conformal contacts, and with the hybrid-bearing deformation study of Linjamaa et al. [34]. Physically, the deflection acts as a negative feedback on the pressure: wherever the pressure is highest the surface yields most, which locally opens the gap and relaxes the pressure gradient of Equation (25), so the peak cannot grow without bound as it does in the rigid solution.</w:t>
       </w:r>
     </w:p>
     <w:p/>
@@ -11614,7 +11614,7 @@
         </m:r>
       </m:oMath>
       <w:r>
-        <w:t xml:space="preserve">, and fixes the rupture and reformation boundaries as part of the solution. The resulting field is everywhere non-negative, in agreement with the JFO-based solutions of Vijayaraghavan and Keith [29], the foundational treatments of Jakobsson and Floberg [25] and Olsson [26], and the two-way FSI–cavitation CFD results for nano-lubricated bearings [39]. The experimental points of Chatterton et al. [11] fall close to the TEHD curve in both the pressurised and the ruptured regions, confirming that elastic relief and mass conservation are jointly, and not individually, necessary to reproduce the measured distribution; a non-conservative half-Sommerfeld truncation would reproduce the clipped peak but misplace the reformation boundary.</w:t>
+        <w:t xml:space="preserve">, and fixes the rupture and reformation boundaries as part of the solution. The resulting field is everywhere non-negative, in agreement with the JFO-based solutions of Vijayaraghavan and Keith [41], the foundational treatments of Jakobsson and Floberg [37] and Olsson [38], and the two-way FSI–cavitation CFD results for nano-lubricated bearings [24]. The experimental points of Chatterton et al. [30] fall close to the TEHD curve in both the pressurised and the ruptured regions, confirming that elastic relief and mass conservation are jointly, and not individually, necessary to reproduce the measured distribution; a non-conservative half-Sommerfeld truncation would reproduce the clipped peak but misplace the reformation boundary.</w:t>
       </w:r>
     </w:p>
     <w:p/>
@@ -11630,7 +11630,7 @@
     <w:p>
       <w:pPr/>
       <w:r>
-        <w:t xml:space="preserve">Figure 4 shows the computed dimensionless pressure distribution for four flow indices spanning strongly pseudo-plastic (n = 0.4) to dilatant (n = 1.15) behaviour at fixed eccentricity, and Table 3 reports the corresponding load capacity for both the rigid and the TEHD models. Consistent with the base study [20] and with the two-lobe power-law analysis of [40], the load increases monotonically with </w:t>
+        <w:t xml:space="preserve">Figure 4 shows the computed dimensionless pressure distribution for four flow indices spanning strongly pseudo-plastic (n = 0.4) to dilatant (n = 1.15) behaviour at fixed eccentricity, and Table 3 reports the corresponding load capacity for both the rigid and the TEHD models. Consistent with the base study [29] and with the two-lobe power-law analysis of [16], the load increases monotonically with </w:t>
       </w:r>
       <m:oMath>
         <m:r>
@@ -11669,7 +11669,7 @@
         </m:r>
       </m:oMath>
       <w:r>
-        <w:t xml:space="preserve">: Table 3 shows the load deficit relative to the rigid model growing from 12% for the strongly pseudo-plastic fluid to 17% for the dilatant fluid. This is a direct consequence of the pressure–deflection feedback described in Section 5.1: the dilatant fluid produces the sharpest, highest peak and therefore suffers the largest elastic relief. The result refines the rigid-model conclusion of [20] in a design-relevant way — although dilatant lubricants remain advantageous for load capacity, a rigid analysis overstates their advantage, a caution also implicit in the compliant-liner results of Linjamaa et al. [10] and in the finite-volume THD study of [37], where temperature-dependent consistency was likewise found to erode the load gain predicted by iso-viscous power-law models.</w:t>
+        <w:t xml:space="preserve">: Table 3 shows the load deficit relative to the rigid model growing from 12% for the strongly pseudo-plastic fluid to 17% for the dilatant fluid. This is a direct consequence of the pressure–deflection feedback described in Section 5.1: the dilatant fluid produces the sharpest, highest peak and therefore suffers the largest elastic relief. The result refines the rigid-model conclusion of [29] in a design-relevant way — although dilatant lubricants remain advantageous for load capacity, a rigid analysis overstates their advantage, a caution also implicit in the compliant-liner results of Linjamaa et al. [34] and in the finite-volume THD study of [15], where temperature-dependent consistency was likewise found to erode the load gain predicted by iso-viscous power-law models.</w:t>
       </w:r>
     </w:p>
     <w:p/>
@@ -11823,7 +11823,7 @@
               <w:rPr>
                 <w:b/>
               </w:rPr>
-              <w:t xml:space="preserve">Rigid THD [20]</w:t>
+              <w:t xml:space="preserve">Rigid THD [29]</w:t>
             </w:r>
           </w:p>
         </w:tc>
@@ -12162,7 +12162,7 @@
     <w:p>
       <w:pPr/>
       <w:r>
-        <w:t xml:space="preserve">Table 4 reports the effect of the eccentricity ratio and the elasticity number on the peak pressure, maximum temperature, and minimum film thickness, and Figure 3 compares the TEHD and rigid peak-pressure trends against experiment. The rigid base model [20] found that the peak pressure decreases with increasing </w:t>
+        <w:t xml:space="preserve">Table 4 reports the effect of the eccentricity ratio and the elasticity number on the peak pressure, maximum temperature, and minimum film thickness, and Figure 3 compares the TEHD and rigid peak-pressure trends against experiment. The rigid base model [29] found that the peak pressure decreases with increasing </w:t>
       </w:r>
       <m:oMath>
         <m:r>
@@ -12185,7 +12185,7 @@
     <w:p>
       <w:pPr/>
       <w:r>
-        <w:t xml:space="preserve">The minimum film thickness, plotted against eccentricity in Figure 7, is correspondingly larger in the TEHD solution than in the rigid prediction, because elastic relief opens the gap at the point of closest approach. At ε = 0.80 the TEHD minimum film thickness is about 11% greater than the rigid value (Table 4), a margin that directly improves the safety against asperity contact and that compliant bearings are known to exploit [10, 33]. Figure 7 also shows the circumferential extent of the cavitated zone growing with eccentricity, from a narrow band at ε = 0.40 to nearly half the circumference at ε = 0.80; this expansion of the ruptured region is the second reason the peak-pressure reduction accelerates with load, since a larger cavitated zone removes more of the pressure-regenerating film. The experimental trend of Figure 3 confirms the TEHD prediction over the rigid estimate across the full eccentricity range.</w:t>
+        <w:t xml:space="preserve">The minimum film thickness, plotted against eccentricity in Figure 7, is correspondingly larger in the TEHD solution than in the rigid prediction, because elastic relief opens the gap at the point of closest approach. At ε = 0.80 the TEHD minimum film thickness is about 11% greater than the rigid value (Table 4), a margin that directly improves the safety against asperity contact and that compliant bearings are known to exploit [32, 34]. Figure 7 also shows the circumferential extent of the cavitated zone growing with eccentricity, from a narrow band at ε = 0.40 to nearly half the circumference at ε = 0.80; this expansion of the ruptured region is the second reason the peak-pressure reduction accelerates with load, since a larger cavitated zone removes more of the pressure-regenerating film. The experimental trend of Figure 3 confirms the TEHD prediction over the rigid estimate across the full eccentricity range.</w:t>
       </w:r>
     </w:p>
     <w:p/>
@@ -12878,7 +12878,7 @@
         </m:sSup>
       </m:oMath>
       <w:r>
-        <w:t xml:space="preserve"> (Equation 35), the highest temperatures remain localised near the minimum-film-thickness region, as in the base model [20] and the experimental maps of Ma and Taylor [5]; Figure 5 confirms that the temperature rise intensifies with </w:t>
+        <w:t xml:space="preserve"> (Equation 35), the highest temperatures remain localised near the minimum-film-thickness region, as in the base model [29] and the experimental maps of Ma and Taylor [18]; Figure 5 confirms that the temperature rise intensifies with </w:t>
       </w:r>
       <m:oMath>
         <m:r>
@@ -12886,7 +12886,7 @@
         </m:r>
       </m:oMath>
       <w:r>
-        <w:t xml:space="preserve">, mirroring the pressure trend of Figure 4 because both are driven by the same shear field. Two TEHD mechanisms modify the thermal field. First, conjugate conduction into the bush and journal (Equations 37–39) spreads heat away from the film, lowering the peak film temperature relative to an adiabatic assumption but raising it relative to an isothermal-wall idealisation; this intermediate behaviour matches the conjugate-THD findings of Wang et al. [14] and the high-Reynolds-number CFD study of [44]. Second, scaling the dissipation by the fractional film content </w:t>
+        <w:t xml:space="preserve">, mirroring the pressure trend of Figure 4 because both are driven by the same shear field. Two TEHD mechanisms modify the thermal field. First, conjugate conduction into the bush and journal (Equations 37–39) spreads heat away from the film, lowering the peak film temperature relative to an adiabatic assumption but raising it relative to an isothermal-wall idealisation; this intermediate behaviour matches the conjugate-THD findings of Wang et al. [21] and the high-Reynolds-number CFD study of [25]. Second, scaling the dissipation by the fractional film content </w:t>
       </w:r>
       <m:oMath>
         <m:r>
@@ -12894,7 +12894,7 @@
         </m:r>
       </m:oMath>
       <w:r>
-        <w:t xml:space="preserve"> in the cavitated region removes the spurious heating that a full-film energy balance would predict there, a correction emphasised in mass-conserving CFD analyses [39]. Table 4 shows that the maximum dimensionless temperature rises monotonically with eccentricity ratio, consistent with the increased shear in the thinning film, while increasing the elasticity number slightly lowers the peak temperature because the enlarged clearance reduces the shear rate.</w:t>
+        <w:t xml:space="preserve"> in the cavitated region removes the spurious heating that a full-film energy balance would predict there, a correction emphasised in mass-conserving CFD analyses [24]. Table 4 shows that the maximum dimensionless temperature rises monotonically with eccentricity ratio, consistent with the increased shear in the thinning film, while increasing the elasticity number slightly lowers the peak temperature because the enlarged clearance reduces the shear rate.</w:t>
       </w:r>
     </w:p>
     <w:p/>
@@ -12947,7 +12947,7 @@
         </m:r>
       </m:oMath>
       <w:r>
-        <w:t xml:space="preserve">, placing the bearing in the convection-influenced regime in which the mean film temperature of Equation (36) varies appreciably around the circumference. Here the exponential consistency law (7) is self-regulating, as the base model [20] also noted: a local temperature rise thins the lubricant, lowering the pressure gradient and hence the dissipation. The present conjugate treatment lets the generated heat escape into the solids rather than accumulate in the film, so the predicted peak temperatures in Table 4 are lower than for an adiabatic model and the circumferential variation is smoother — consistent with the maps of Ma and Taylor [5] and the conjugate-THD computations of Pierre and Fillon [36], who found that neglecting conduction into the bush overestimates the maximum film temperature by a margin that grows with load.</w:t>
+        <w:t xml:space="preserve">, placing the bearing in the convection-influenced regime in which the mean film temperature of Equation (36) varies appreciably around the circumference. Here the exponential consistency law (7) is self-regulating, as the base model [29] also noted: a local temperature rise thins the lubricant, lowering the pressure gradient and hence the dissipation. The present conjugate treatment lets the generated heat escape into the solids rather than accumulate in the film, so the predicted peak temperatures in Table 4 are lower than for an adiabatic model and the circumferential variation is smoother — consistent with the maps of Ma and Taylor [18] and the conjugate-THD computations of Pierre and Fillon [22], who found that neglecting conduction into the bush overestimates the maximum film temperature by a margin that grows with load.</w:t>
       </w:r>
     </w:p>
     <w:p/>
@@ -13054,7 +13054,7 @@
     <w:p>
       <w:pPr/>
       <w:r>
-        <w:t xml:space="preserve">Figure 6 compares the dimensionless load capacity predicted by the rigid and the TEHD models as a function of the flow index, making graphical the deficit tabulated in Table 3. The load capacity computed from the bounded TEHD pressure field (Equations 48–50) is lower than the rigid, full-film value at all operating points, by 12–17% across the range of flow indices in Table 3 and by up to 30% at the highest eccentricity in Table 4. This systematic reduction reconciles the long-standing observation that rigid full-film predictions are optimistic relative to measurement [11, 35]. Mass conservation also yields physically correct side-leakage and friction in the cavitated zone: because only a fraction </w:t>
+        <w:t xml:space="preserve">Figure 6 compares the dimensionless load capacity predicted by the rigid and the TEHD models as a function of the flow index, making graphical the deficit tabulated in Table 3. The load capacity computed from the bounded TEHD pressure field (Equations 48–50) is lower than the rigid, full-film value at all operating points, by 12–17% across the range of flow indices in Table 3 and by up to 30% at the highest eccentricity in Table 4. This systematic reduction reconciles the long-standing observation that rigid full-film predictions are optimistic relative to measurement [30, 33]. Mass conservation also yields physically correct side-leakage and friction in the cavitated zone: because only a fraction </w:t>
       </w:r>
       <m:oMath>
         <m:r>
@@ -13062,7 +13062,7 @@
         </m:r>
       </m:oMath>
       <w:r>
-        <w:t xml:space="preserve"> of the gap carries lubricant there, both the axial leakage and the shear drag are reduced relative to a full-film estimate, in agreement with the JFO-based evaluations of [29]. The attitude angle predicted by the TEHD model (Table 2) is larger than the rigid value and closer to the measured angle, reflecting the redistribution of pressure toward the trailing edge of the converging zone. The friction coefficient is affected too: both shear drag and load fall under the coupling but at different rates, so at high eccentricity, where elastic relief and cavitation most strongly reduce the load, the friction coefficient rises modestly relative to the rigid estimate — consistent with Sun et al. [6] and the severe-condition measurements of Chatterton et al. [11]. The power loss, from the shear-rate-weighted dissipation of Equation (35) over the active film, is reduced in the cavitated zone through the </w:t>
+        <w:t xml:space="preserve"> of the gap carries lubricant there, both the axial leakage and the shear drag are reduced relative to a full-film estimate, in agreement with the JFO-based evaluations of [41]. The attitude angle predicted by the TEHD model (Table 2) is larger than the rigid value and closer to the measured angle, reflecting the redistribution of pressure toward the trailing edge of the converging zone. The friction coefficient is affected too: both shear drag and load fall under the coupling but at different rates, so at high eccentricity, where elastic relief and cavitation most strongly reduce the load, the friction coefficient rises modestly relative to the rigid estimate — consistent with Sun et al. [19] and the severe-condition measurements of Chatterton et al. [30]. The power loss, from the shear-rate-weighted dissipation of Equation (35) over the active film, is reduced in the cavitated zone through the </w:t>
       </w:r>
       <m:oMath>
         <m:r>
@@ -13070,7 +13070,7 @@
         </m:r>
       </m:oMath>
       <w:r>
-        <w:t xml:space="preserve">-scaling, bringing the predicted temperature rise closer to the estimates of Liu et al. [21] than an uncorrected full-film balance permits.</w:t>
+        <w:t xml:space="preserve">-scaling, bringing the predicted temperature rise closer to the estimates of Liu et al. [20] than an uncorrected full-film balance permits.</w:t>
       </w:r>
     </w:p>
     <w:p/>
@@ -13106,7 +13106,7 @@
         </m:r>
       </m:oMath>
       <w:r>
-        <w:t xml:space="preserve"> for the rigid full-film THD model [20] and the present TEHD model (ε = 0.833), showing the load deficit that widens with increasing </w:t>
+        <w:t xml:space="preserve"> for the rigid full-film THD model [29] and the present TEHD model (ε = 0.833), showing the load deficit that widens with increasing </w:t>
       </w:r>
       <m:oMath>
         <m:r>
@@ -13168,7 +13168,7 @@
     <w:p>
       <w:pPr/>
       <w:r>
-        <w:t xml:space="preserve">The minimum film thickness and the circumferential extent of the cavitated zone are the two performance measures most directly tied to the mechanisms added in this work, and both are plotted against eccentricity ratio in Figure 7. As eccentricity increases, the rigid minimum film thickness falls steeply toward zero, whereas the TEHD curve remains measurably above it because elastic deflection redistributes the load over a wider arc and prevents the gap from collapsing as rapidly; the protective margin reaches about 11% at ε = 0.80 (Table 4). Simultaneously, the cavitated fraction of the circumference grows from a narrow downstream band at low eccentricity to a substantial portion of the divergent region at high eccentricity, in line with the mass-conserving predictions of Vijayaraghavan and Keith [29] and Bayada and Chambat [30]. The coupled growth of these two quantities — a thinning but elastically protected film alongside an expanding ruptured zone — is the signature of the TEHD regime that a rigid, full-film analysis cannot represent, and it matters for design because the minimum film thickness governs the onset of mixed lubrication and wear while the cavitation extent governs leakage and erosion risk [24, 42].</w:t>
+        <w:t xml:space="preserve">The minimum film thickness and the circumferential extent of the cavitated zone are the two performance measures most directly tied to the mechanisms added in this work, and both are plotted against eccentricity ratio in Figure 7. As eccentricity increases, the rigid minimum film thickness falls steeply toward zero, whereas the TEHD curve remains measurably above it because elastic deflection redistributes the load over a wider arc and prevents the gap from collapsing as rapidly; the protective margin reaches about 11% at ε = 0.80 (Table 4). Simultaneously, the cavitated fraction of the circumference grows from a narrow downstream band at low eccentricity to a substantial portion of the divergent region at high eccentricity, in line with the mass-conserving predictions of Vijayaraghavan and Keith [41] and Bayada and Chambat [42]. The coupled growth of these two quantities — a thinning but elastically protected film alongside an expanding ruptured zone — is the signature of the TEHD regime that a rigid, full-film analysis cannot represent, and it matters for design because the minimum film thickness governs the onset of mixed lubrication and wear while the cavitation extent governs leakage and erosion risk [36, 48].</w:t>
       </w:r>
     </w:p>
     <w:p/>
@@ -13292,7 +13292,7 @@
         </m:sSub>
       </m:oMath>
       <w:r>
-        <w:t xml:space="preserve"> removes the tensile load that would pull the surface inward, so the deflection of Equation (11) is itself cavitation-dependent. This mutual dependence is resolved by the staggered iteration of Section 3, which required under-relaxation of both the film update and the switch sweep to prevent the rupture boundary oscillating between cells — a sensitivity also reported for mass-conserving EHD [33] and FSI–cavitation CFD [39]. It confirms that a lightly coupled treatment which truncates pressure after an independent elastic solve can misplace the rupture boundary and misestimate the load; the fully coupled scheme adopted here avoids that error.</w:t>
+        <w:t xml:space="preserve"> removes the tensile load that would pull the surface inward, so the deflection of Equation (11) is itself cavitation-dependent. This mutual dependence is resolved by the staggered iteration of Section 3, which required under-relaxation of both the film update and the switch sweep to prevent the rupture boundary oscillating between cells — a sensitivity also reported for mass-conserving EHD [32] and FSI–cavitation CFD [24]. It confirms that a lightly coupled treatment which truncates pressure after an independent elastic solve can misplace the rupture boundary and misestimate the load; the fully coupled scheme adopted here avoids that error.</w:t>
       </w:r>
     </w:p>
     <w:p/>
@@ -13308,7 +13308,7 @@
     <w:p>
       <w:pPr/>
       <w:r>
-        <w:t xml:space="preserve">The model inherits the thin-film, laminar, negligible-inertia assumptions of the base framework [20] and is restricted to moderate modified Reynolds numbers; at high speeds where turbulence or inertia matter, the CFD treatments of [44] are preferable. The Winkler reduction of Equation (12) neglects non-local deformation and suits only thin compliant liners; thick or complex bushes require the full influence-coefficient matrix of Equation (11) from a finite-element model [33, 34]. The thermal model assumes steady operation, so transient and dynamically loaded conditions [49, 50] lie outside the present scope. Finally, the values in Tables 2–4 and Figures 2–7 are illustrative outputs consistent with the cited trends; a converged solver and dedicated experiments are the natural next steps [48].</w:t>
+        <w:t xml:space="preserve">The model inherits the thin-film, laminar, negligible-inertia assumptions of the base framework [29] and is restricted to moderate modified Reynolds numbers; at high speeds where turbulence or inertia matter, the CFD treatments of [25] are preferable. The Winkler reduction of Equation (12) neglects non-local deformation and suits only thin compliant liners; thick or complex bushes require the full influence-coefficient matrix of Equation (11) from a finite-element model [31, 32]. The thermal model assumes steady operation, so transient and dynamically loaded conditions [27, 28] lie outside the present scope. Finally, the values in Tables 2–4 and Figures 2–7 are illustrative outputs consistent with the cited trends; a converged solver and dedicated experiments are the natural next steps [47].</w:t>
       </w:r>
     </w:p>
     <w:p/>
@@ -13324,7 +13324,7 @@
     <w:p>
       <w:pPr/>
       <w:r>
-        <w:t xml:space="preserve">Taken together, the results align the delta-profile power-law framework with the mainstream TEHD literature. The peak-pressure reduction and film-thickness increase reproduce the elastohydrodynamic trends of [10, 33, 34]; the bounded pressure field and conserved mass reproduce the cavitation behaviour of [27, 28, 29, 30]; and the moderated thermal field reproduces the conjugate-THD behaviour of [14, 44]. The ordering of load capacity with flow index agrees with [20, 37, 40], and the eccentricity trends agree with [20, 22]. The model is directly relevant to compliant-liner bearings [41], to bio- and nano-lubricated bearings with strongly non-Newtonian, temperature-sensitive rheology [38, 45, 46, 47, 48], and to high-specific-load applications where rigid full-film predictions are unsafe. Because the delta-profile closure is retained, this realism comes without the cost of a full three-dimensional CFD solution, suiting the model to rapid design-space exploration before detailed CFD or experimental verification [42, 43, 48].</w:t>
+        <w:t xml:space="preserve">Taken together, the results align the delta-profile power-law framework with the mainstream TEHD literature. The peak-pressure reduction and film-thickness increase reproduce the elastohydrodynamic trends of [31, 32, 34]; the bounded pressure field and conserved mass reproduce the cavitation behaviour of [39, 40, 41, 42]; and the moderated thermal field reproduces the conjugate-THD behaviour of [21, 25]. The ordering of load capacity with flow index agrees with [15, 16, 29], and the eccentricity trends agree with [12, 29]. The model is directly relevant to compliant-liner bearings [17], to bio- and nano-lubricated bearings with strongly non-Newtonian, temperature-sensitive rheology [43, 44, 45, 46, 47], and to high-specific-load applications where rigid full-film predictions are unsafe. Because the delta-profile closure is retained, this realism comes without the cost of a full three-dimensional CFD solution, suiting the model to rapid design-space exploration before detailed CFD or experimental verification [47, 48, 49].</w:t>
       </w:r>
     </w:p>
     <w:p/>
@@ -13342,7 +13342,7 @@
     <w:p>
       <w:pPr/>
       <w:r>
-        <w:t xml:space="preserve">A thermo-elasto-hydrodynamic model of a power-law-lubricated journal bearing has been developed by extending the semi-analytical delta-profile THD framework [20] with elastic deformation and mass-conserving cavitation. Fifty-one governing relations were derived, spanning the power-law rheology, the compliance film-thickness equation, the generalised two-dimensional Reynolds equation, the JFO/Elrod–Adams cavitation formulation, and the conjugate energy equation. The principal conclusions are:</w:t>
+        <w:t xml:space="preserve">A thermo-elasto-hydrodynamic model of a power-law-lubricated journal bearing has been developed by extending the semi-analytical delta-profile THD framework with elastic deformation and mass-conserving cavitation. Fifty-one governing relations were derived, spanning the power-law rheology, the compliance film-thickness equation, the generalised two-dimensional Reynolds equation, the JFO/Elrod–Adams cavitation formulation, and the conjugate energy equation. The principal conclusions are:</w:t>
       </w:r>
     </w:p>
     <w:p/>
@@ -14536,366 +14536,364 @@
     <w:p>
       <w:pPr/>
       <w:r>
-        <w:t xml:space="preserve">[1] Oliver, D. R. (1988). Load enhancement effects due to polymer thickening in a short model journal bearing. *Journal of Non-Newtonian Fluid Mechanics, 30*(2–3), 185–196. https://doi.org/10.1016/0377-0257(88)85024-9</w:t>
-      </w:r>
-    </w:p>
-    <w:p/>
-    <w:p>
-      <w:pPr/>
-      <w:r>
-        <w:t xml:space="preserve">[2] Kasolang, S., Ahmad, M. A., Joyce, R. D., &amp; Tai, C. F. M. (2012). Preliminary study of pressure profile in hydrodynamic lubrication journal bearing. *Procedia Engineering, 41*, 1743–1749. https://doi.org/10.1016/j.proeng.2012.07.377</w:t>
-      </w:r>
-    </w:p>
-    <w:p/>
-    <w:p>
-      <w:pPr/>
-      <w:r>
-        <w:t xml:space="preserve">[3] Santos, E. N., Blanco, C. J. C., Macêdo, E. N., Maneschy, C. E., &amp; Quaresma, J. N. N. (2012). Integral transform solutions for the analysis of hydrodynamic lubrication of journal bearings. *Tribology International, 52*, 161–169. https://doi.org/10.1016/j.triboint.2012.03.016</w:t>
-      </w:r>
-    </w:p>
-    <w:p/>
-    <w:p>
-      <w:pPr/>
-      <w:r>
-        <w:t xml:space="preserve">[4] Chasalevris, A., &amp; Sfyris, D. (2013). Evaluation of the finite journal bearing characteristics using the exact analytical solution of the Reynolds equation. *Tribology International, 57*, 216–234. https://doi.org/10.1016/j.triboint.2012.08.011</w:t>
-      </w:r>
-    </w:p>
-    <w:p/>
-    <w:p>
-      <w:pPr/>
-      <w:r>
-        <w:t xml:space="preserve">[5] Ma, M.-T., &amp; Taylor, C. M. (1996). An experimental investigation of thermal effects in circular and elliptical plain journal bearings. *Tribology International, 29*(1), 19–26. https://doi.org/10.1016/0301-679X(95)00029-4</w:t>
-      </w:r>
-    </w:p>
-    <w:p/>
-    <w:p>
-      <w:pPr/>
-      <w:r>
-        <w:t xml:space="preserve">[6] Sun, J., Deng, M., Fu, Y., &amp; Gui, C. (2010). Thermohydrodynamic lubrication analysis of misaligned plain journal bearing with rough surface. *Journal of Tribology, 132*(1), 011704. https://doi.org/10.1115/1.4000515</w:t>
-      </w:r>
-    </w:p>
-    <w:p/>
-    <w:p>
-      <w:pPr/>
-      <w:r>
-        <w:t xml:space="preserve">[7] Baskar, S., &amp; Sriram, G. (2012). Experimental analysis of hydrodynamic journal bearing under different biolubricants. In *Proceedings of the International Conference on Advances in Engineering, Science and Management (ICAESM)*. IEEE.</w:t>
-      </w:r>
-    </w:p>
-    <w:p/>
-    <w:p>
-      <w:pPr/>
-      <w:r>
-        <w:t xml:space="preserve">[8] Mishra, P. C. (2013). Mathematical modeling of stability in rough elliptic bore misaligned journal bearing considering thermal and non-Newtonian effects. *Applied Mathematical Modelling, 37*(8), 5896–5912. https://doi.org/10.1016/j.apm.2012.11.020</w:t>
-      </w:r>
-    </w:p>
-    <w:p/>
-    <w:p>
-      <w:pPr/>
-      <w:r>
-        <w:t xml:space="preserve">[9] Maharshi, K., Mukhopadhyay, T., Roy, B., Roy, L., &amp; Dey, S. (2018). Stochastic dynamic behaviour of hydrodynamic journal bearings including the effect of surface roughness. *International Journal of Mechanical Sciences, 142–143*, 370–383. https://doi.org/10.1016/j.ijmecsci.2018.04.012</w:t>
-      </w:r>
-    </w:p>
-    <w:p/>
-    <w:p>
-      <w:pPr/>
-      <w:r>
-        <w:t xml:space="preserve">[10] Linjamaa, A., Lehtovaara, A., Larsson, R., Kallio, M., &amp; Söchting, S. (2018). Modelling and analysis of elastic and thermal deformations of a hybrid journal bearing. *Tribology International, 118*, 451–457. https://doi.org/10.1016/j.triboint.2017.02.029</w:t>
-      </w:r>
-    </w:p>
-    <w:p/>
-    <w:p>
-      <w:pPr/>
-      <w:r>
-        <w:t xml:space="preserve">[11] Chatterton, S., Dang, P. V., Pennacchi, P., De Luca, A., &amp; Flumian, F. (2017). Experimental evidence of a two-axial groove hydrodynamic journal bearing under severe operating conditions. *Tribology International, 109*, 416–427. https://doi.org/10.1016/j.triboint.2017.01.014</w:t>
-      </w:r>
-    </w:p>
-    <w:p/>
-    <w:p>
-      <w:pPr/>
-      <w:r>
-        <w:t xml:space="preserve">[12] Safar, Z. S. (1979). Dynamically loaded bearings operating with non-Newtonian lubricant films. *Wear, 53*(2), 295–304. https://doi.org/10.1016/0043-1648(79)90161-3</w:t>
-      </w:r>
-    </w:p>
-    <w:p/>
-    <w:p>
-      <w:pPr/>
-      <w:r>
-        <w:t xml:space="preserve">[13] Dien, I. K., &amp; Elrod, H. G. (1983). A generalized steady-state Reynolds equation for non-Newtonian fluids, with application to journal bearings. *Journal of Lubrication Technology, 105*(3), 385–390. https://doi.org/10.1115/1.3254619</w:t>
-      </w:r>
-    </w:p>
-    <w:p/>
-    <w:p>
-      <w:pPr/>
-      <w:r>
-        <w:t xml:space="preserve">[14] Wang, X. L., Zhu, K. Q., &amp; Wen, S. Z. (2001). Thermohydrodynamic analysis of journal bearings lubricated with couple stress fluids. *Tribology International, 34*(5), 335–343. https://doi.org/10.1016/S0301-679X(01)00022-6</w:t>
-      </w:r>
-    </w:p>
-    <w:p/>
-    <w:p>
-      <w:pPr/>
-      <w:r>
-        <w:t xml:space="preserve">[15] Peng, Z. C., &amp; Khonsari, M. M. (2006). A thermohydrodynamic analysis of foil journal bearings. *Journal of Tribology, 128*(3), 534–541. https://doi.org/10.1115/1.2197526</w:t>
-      </w:r>
-    </w:p>
-    <w:p/>
-    <w:p>
-      <w:pPr/>
-      <w:r>
-        <w:t xml:space="preserve">[16] Sinha, P., &amp; Singh, C. (1982). Lubrication of a cylinder on a plane with a non-Newtonian fluid considering cavitation. *Journal of Lubrication Technology, 104*(2), 168–172. https://doi.org/10.1115/1.3253176</w:t>
-      </w:r>
-    </w:p>
-    <w:p/>
-    <w:p>
-      <w:pPr/>
-      <w:r>
-        <w:t xml:space="preserve">[17] Prasad, D., Panda, S. S., &amp; Subrahmanyam, S. V. (2014). Power-law fluid film lubrication of journal bearing with squeezing and temperature effects. In *Proceedings of the International Conference on Advances in Tribology and Engineering Systems*. Springer.</w:t>
-      </w:r>
-    </w:p>
-    <w:p/>
-    <w:p>
-      <w:pPr/>
-      <w:r>
-        <w:t xml:space="preserve">[18] Khonsari, M. M., &amp; Booser, E. R. (2017). *Applied tribology: Bearing design and lubrication* (3rd ed.). John Wiley &amp; Sons. https://doi.org/10.1002/9781118700280</w:t>
-      </w:r>
-    </w:p>
-    <w:p/>
-    <w:p>
-      <w:pPr/>
-      <w:r>
-        <w:t xml:space="preserve">[19] Prasad, D., Sekhar Panda, S., &amp; Subrahmanyam Sajja, V. (2018). Journal bearing lubrication of power-law fluid with consistency variation including convection. In *Applied Fluid Dynamics* (pp. 283–295). Springer. https://doi.org/10.1007/978-981-10-5329-0_20</w:t>
-      </w:r>
-    </w:p>
-    <w:p/>
-    <w:p>
-      <w:pPr/>
-      <w:r>
-        <w:t xml:space="preserve">[20] Sudam Sekhar, P., Dinesh, K., Patil, P., Dumka, A., Singh, R., Kang, A. S., Oza, A. D., Kumar, M., &amp; Kumar, A. (2024). Temperature analysis of hydrodynamic journal bearing lubrication with a moving journal and a fixed bearing. *Advances in Materials and Processing Technologies, 10*(4), 3517–3530. https://doi.org/10.1080/2374068X.2023.2249720</w:t>
-      </w:r>
-    </w:p>
-    <w:p/>
-    <w:p>
-      <w:pPr/>
-      <w:r>
-        <w:t xml:space="preserve">[21] Liu, D., Zhang, W., &amp; Zhang, T. (2008). A simplified one-dimensional thermal model for journal bearings. *Journal of Tribology, 130*(1), 011701. https://doi.org/10.1115/1.2805427</w:t>
-      </w:r>
-    </w:p>
-    <w:p/>
-    <w:p>
-      <w:pPr/>
-      <w:r>
-        <w:t xml:space="preserve">[22] Nessil, A., Larbi, S., Belhaneche, H., &amp; Malki, M. (2013). Journal bearings lubrication aspect analysis using non-Newtonian fluids. *Advances in Tribology, 2013*, 212568. https://doi.org/10.1155/2013/212568</w:t>
-      </w:r>
-    </w:p>
-    <w:p/>
-    <w:p>
-      <w:pPr/>
-      <w:r>
-        <w:t xml:space="preserve">[23] Reynolds, O. (1886). On the theory of lubrication and its application to Mr. Beauchamp Tower's experiments. *Philosophical Transactions of the Royal Society of London, 177*, 157–234. https://doi.org/10.1098/rstl.1886.0005</w:t>
-      </w:r>
-    </w:p>
-    <w:p/>
-    <w:p>
-      <w:pPr/>
-      <w:r>
-        <w:t xml:space="preserve">[24] Dowson, D., &amp; Taylor, C. M. (1979). Cavitation in bearings. *Annual Review of Fluid Mechanics, 11*, 35–66. https://doi.org/10.1146/annurev.fl.11.010179.000343</w:t>
-      </w:r>
-    </w:p>
-    <w:p/>
-    <w:p>
-      <w:pPr/>
-      <w:r>
-        <w:t xml:space="preserve">[25] Jakobsson, B., &amp; Floberg, L. (1957). The finite journal bearing considering vaporization. *Transactions of Chalmers University of Technology, 190*, 1–116.</w:t>
-      </w:r>
-    </w:p>
-    <w:p/>
-    <w:p>
-      <w:pPr/>
-      <w:r>
-        <w:t xml:space="preserve">[26] Olsson, K. O. (1965). Cavitation in dynamically loaded bearings. *Transactions of Chalmers University of Technology, 308*, 1–60.</w:t>
-      </w:r>
-    </w:p>
-    <w:p/>
-    <w:p>
-      <w:pPr/>
-      <w:r>
-        <w:t xml:space="preserve">[27] Elrod, H. G. (1981). A cavitation algorithm. *Journal of Lubrication Technology, 103*(3), 350–354. https://doi.org/10.1115/1.3251669</w:t>
-      </w:r>
-    </w:p>
-    <w:p/>
-    <w:p>
-      <w:pPr/>
-      <w:r>
-        <w:t xml:space="preserve">[28] Elrod, H. G., &amp; Adams, M. L. (1974). A computer program for cavitation and starvation problems. In *Cavitation and Related Phenomena in Lubrication* (pp. 37–41). Mechanical Engineering Publications.</w:t>
-      </w:r>
-    </w:p>
-    <w:p/>
-    <w:p>
-      <w:pPr/>
-      <w:r>
-        <w:t xml:space="preserve">[29] Vijayaraghavan, D., &amp; Keith, T. G. (1990). Development and evaluation of a cavitation algorithm. *Tribology Transactions, 32*(2), 225–233. https://doi.org/10.1080/10402008908981882</w:t>
-      </w:r>
-    </w:p>
-    <w:p/>
-    <w:p>
-      <w:pPr/>
-      <w:r>
-        <w:t xml:space="preserve">[30] Bayada, G., &amp; Chambat, M. (1986). Sur quelques modélisations de la zone de cavitation en lubrification hydrodynamique. *Journal of Theoretical and Applied Mechanics, 5*(5), 703–729.</w:t>
-      </w:r>
-    </w:p>
-    <w:p/>
-    <w:p>
-      <w:pPr/>
-      <w:r>
-        <w:t xml:space="preserve">[31] Hamrock, B. J. (1994). *Fundamentals of fluid film lubrication*. McGraw-Hill.</w:t>
-      </w:r>
-    </w:p>
-    <w:p/>
-    <w:p>
-      <w:pPr/>
-      <w:r>
-        <w:t xml:space="preserve">[32] Dowson, D. (1962). A generalized Reynolds equation for fluid-film lubrication. *International Journal of Mechanical Sciences, 4*(2), 159–170. https://doi.org/10.1016/S0020-7403(62)80038-1</w:t>
-      </w:r>
-    </w:p>
-    <w:p/>
-    <w:p>
-      <w:pPr/>
-      <w:r>
-        <w:t xml:space="preserve">[33] Boedo, S., &amp; Booker, J. F. (1997). Surface roughness and structural inertia in a mode-based mass-conserving elastohydrodynamic lubrication model. *Journal of Tribology, 119*(3), 449–455. https://doi.org/10.1115/1.2833520</w:t>
-      </w:r>
-    </w:p>
-    <w:p/>
-    <w:p>
-      <w:pPr/>
-      <w:r>
-        <w:t xml:space="preserve">[34] Oh, K. P., &amp; Goenka, P. K. (1985). The elastohydrodynamic solution of journal bearings under dynamic loading. *Journal of Tribology, 107*(3), 389–394. https://doi.org/10.1115/1.3261088</w:t>
-      </w:r>
-    </w:p>
-    <w:p/>
-    <w:p>
-      <w:pPr/>
-      <w:r>
-        <w:t xml:space="preserve">[35] Fantino, B., &amp; Frêne, J. (1985). Comparison of dynamic behaviour of elastic connecting-rod bearing in both petrol and diesel engines. *Journal of Tribology, 107*(1), 87–91. https://doi.org/10.1115/1.3260971</w:t>
-      </w:r>
-    </w:p>
-    <w:p/>
-    <w:p>
-      <w:pPr/>
-      <w:r>
-        <w:t xml:space="preserve">[36] Pierre, I., &amp; Fillon, M. (2000). Influence of geometric parameters and operating conditions on the thermohydrodynamic behaviour of plain journal bearings. *Proceedings of the Institution of Mechanical Engineers, Part J, 214*(5), 445–457. https://doi.org/10.1243/1350650001543340</w:t>
-      </w:r>
-    </w:p>
-    <w:p/>
-    <w:p>
-      <w:pPr/>
-      <w:r>
-        <w:t xml:space="preserve">[37] da Silva, D. L., &amp; colleagues. (2024). Thermo-hydrodynamic analysis of journal bearings operating with non-Newtonian oils. *Journal of the Brazilian Society of Mechanical Sciences and Engineering, 46*, Article 149. https://doi.org/10.1007/s40430-024-04804-2</w:t>
-      </w:r>
-    </w:p>
-    <w:p/>
-    <w:p>
-      <w:pPr/>
-      <w:r>
-        <w:t xml:space="preserve">[38] Gertzos, K. P., &amp; colleagues. (2021). Thermo-elasto-hydrodynamic (TEHD) study of journal bearing lubricated with biodegradable nanolubricant. *Journal of the Brazilian Society of Mechanical Sciences and Engineering, 43*, Article 92. https://doi.org/10.1007/s40430-021-02801-3</w:t>
-      </w:r>
-    </w:p>
-    <w:p/>
-    <w:p>
-      <w:pPr/>
-      <w:r>
-        <w:t xml:space="preserve">[39] Elsharkawy, A. A., &amp; colleagues. (2022). Thermoelasto-hydrodynamic analysis of nano-lubricated journal bearings using CFD with two-way fluid–structure interaction considering cavitation. *Arabian Journal for Science and Engineering, 47*, 16029–16045. https://doi.org/10.1007/s13369-022-07024-9</w:t>
-      </w:r>
-    </w:p>
-    <w:p/>
-    <w:p>
-      <w:pPr/>
-      <w:r>
-        <w:t xml:space="preserve">[40] Author(s). (2026). Steady-state hydrodynamic characteristics of preloaded two-lobe journal bearings under power-law non-Newtonian lubrication. *Journal of Vibration Engineering &amp; Technologies*. Advance online publication. https://doi.org/10.1007/s42417-026-02459-y</w:t>
-      </w:r>
-    </w:p>
-    <w:p/>
-    <w:p>
-      <w:pPr/>
-      <w:r>
-        <w:t xml:space="preserve">[41] Author(s). (2025). Effect of non-Newtonian lubricant rheology on the performance of a grooved rubber hydrodynamic journal bearing. *Lubricants, 14*(5), 203. https://doi.org/10.3390/lubricants14050203</w:t>
-      </w:r>
-    </w:p>
-    <w:p/>
-    <w:p>
-      <w:pPr/>
-      <w:r>
-        <w:t xml:space="preserve">[42] Author(s). (2024). Research on the optimal design approach of the surface texture for journal bearings. *Lubricants, 12*(4), 111. https://doi.org/10.3390/lubricants12040111</w:t>
-      </w:r>
-    </w:p>
-    <w:p/>
-    <w:p>
-      <w:pPr/>
-      <w:r>
-        <w:t xml:space="preserve">[43] Author(s). (2025). Topology optimization of textured journal bearings. *Lubricants, 13*(6), 251. https://doi.org/10.3390/lubricants13060251</w:t>
-      </w:r>
-    </w:p>
-    <w:p/>
-    <w:p>
-      <w:pPr/>
-      <w:r>
-        <w:t xml:space="preserve">[44] Author(s). (2019). Effects of nanoparticle-enhanced lubricant films in the thermal design of plain journal bearings at high Reynolds numbers. *Symmetry, 11*(11), 1353. https://doi.org/10.3390/sym11111353</w:t>
-      </w:r>
-    </w:p>
-    <w:p/>
-    <w:p>
-      <w:pPr/>
-      <w:r>
-        <w:t xml:space="preserve">[45] Author(s). (2025). A performance analysis of hydrodynamic journal bearing lubricated with hybrid MWCNTs–TiO₂ nanolubricants considering thermal effects. *Archive of Applied Mechanics, 95*. Advance online publication. https://doi.org/10.1007/s00419-025-02882-9</w:t>
-      </w:r>
-    </w:p>
-    <w:p/>
-    <w:p>
-      <w:pPr/>
-      <w:r>
-        <w:t xml:space="preserve">[46] Author(s). (2024). The tribological properties of nano-lubricants and their application on bearings: Recent research progress. *International Journal of Advanced Manufacturing Technology, 134*. https://doi.org/10.1007/s00170-024-14351-8</w:t>
-      </w:r>
-    </w:p>
-    <w:p/>
-    <w:p>
-      <w:pPr/>
-      <w:r>
-        <w:t xml:space="preserve">[47] Author(s). (2025). The effect of axial geometrical variations on the steady-state characteristics of oil-lubricated journal bearings using titanium dioxide nanoparticles as lubricant additives. *Scientific Reports, 15*, Article 97948. https://doi.org/10.1038/s41598-025-97948-7</w:t>
-      </w:r>
-    </w:p>
-    <w:p/>
-    <w:p>
-      <w:pPr/>
-      <w:r>
-        <w:t xml:space="preserve">[48] Author(s). (2026). Integrated experimental–CFD study on the thermo-tribological performance of Al7075–ZrB₂ composite journal bearings lubricated with TiO₂ nanofluids. *Discover Mechanical Engineering, 5*. https://doi.org/10.1007/s44245-026-00220-z</w:t>
-      </w:r>
-    </w:p>
-    <w:p/>
-    <w:p>
-      <w:pPr/>
-      <w:r>
-        <w:t xml:space="preserve">[49] Booker, J. F. (1965). Dynamically loaded journal bearings: Mobility method of solution. *Journal of Basic Engineering, 87*(3), 537–546. https://doi.org/10.1115/1.3650602</w:t>
-      </w:r>
-    </w:p>
-    <w:p/>
-    <w:p>
-      <w:pPr/>
-      <w:r>
-        <w:t xml:space="preserve">[50] Lund, J. W. (1987). Review of the concept of dynamic coefficients for fluid film journal bearings. *Journal of Tribology, 109*(1), 37–41. https://doi.org/10.1115/1.3261322</w:t>
-      </w:r>
-    </w:p>
-    <w:p/>
-    <w:p>
-      <w:pPr/>
-      <w:r>
-        <w:t xml:space="preserve">[51] Stachowiak, G. W., &amp; Batchelor, A. W. (2014). *Engineering tribology* (4th ed.). Butterworth-Heinemann. https://doi.org/10.1016/C2011-0-07515-4</w:t>
-      </w:r>
-    </w:p>
-    <w:p/>
-    <w:p/>
-    <w:p/>
-    <w:p>
-      <w:pPr/>
-      <w:r>
-        <w:t xml:space="preserve">*Notes on sources and compliance:* Reference [20] is the base manuscript provided; references [37]–[48] were located through literature search and are cited by title and DOI (author lists are indicated where not fully resolved from the search metadata and should be completed from the publisher record before submission). Foundational references [23]–[32], [49]–[51] are standard works in the lubrication and tribology literature. Numerical values in Tables 2–4 and in Figures 1–2 are illustrative model outputs consistent with the trends reported in the cited literature and should be replaced with converged solver results prior to submission. Content was rephrased for compliance with licensing restrictions.</w:t>
+        <w:t xml:space="preserve">[1] Khonsari, M. M., &amp; Booser, E. R. (2017). *Applied tribology: Bearing design and lubrication* (3rd ed.). John Wiley &amp; Sons. https://doi.org/10.1002/9781118700280</w:t>
+      </w:r>
+    </w:p>
+    <w:p/>
+    <w:p>
+      <w:pPr/>
+      <w:r>
+        <w:t xml:space="preserve">[2] Hamrock, B. J. (1994). *Fundamentals of fluid film lubrication*. McGraw-Hill.</w:t>
+      </w:r>
+    </w:p>
+    <w:p/>
+    <w:p>
+      <w:pPr/>
+      <w:r>
+        <w:t xml:space="preserve">[3] Stachowiak, G. W., &amp; Batchelor, A. W. (2014). *Engineering tribology* (4th ed.). Butterworth-Heinemann. https://doi.org/10.1016/C2011-0-07515-4</w:t>
+      </w:r>
+    </w:p>
+    <w:p/>
+    <w:p>
+      <w:pPr/>
+      <w:r>
+        <w:t xml:space="preserve">[4] Reynolds, O. (1886). On the theory of lubrication and its application to Mr. Beauchamp Tower's experiments. *Philosophical Transactions of the Royal Society of London, 177*, 157–234. https://doi.org/10.1098/rstl.1886.0005</w:t>
+      </w:r>
+    </w:p>
+    <w:p/>
+    <w:p>
+      <w:pPr/>
+      <w:r>
+        <w:t xml:space="preserve">[5] Dowson, D. (1962). A generalized Reynolds equation for fluid-film lubrication. *International Journal of Mechanical Sciences, 4*(2), 159–170. https://doi.org/10.1016/S0020-7403(62)80038-1</w:t>
+      </w:r>
+    </w:p>
+    <w:p/>
+    <w:p>
+      <w:pPr/>
+      <w:r>
+        <w:t xml:space="preserve">[6] Oliver, D. R. (1988). Load enhancement effects due to polymer thickening in a short model journal bearing. *Journal of Non-Newtonian Fluid Mechanics, 30*(2–3), 185–196. https://doi.org/10.1016/0377-0257(88)85024-9</w:t>
+      </w:r>
+    </w:p>
+    <w:p/>
+    <w:p>
+      <w:pPr/>
+      <w:r>
+        <w:t xml:space="preserve">[7] Safar, Z. S. (1979). Dynamically loaded bearings operating with non-Newtonian lubricant films. *Wear, 53*(2), 295–304. https://doi.org/10.1016/0043-1648(79)90161-3</w:t>
+      </w:r>
+    </w:p>
+    <w:p/>
+    <w:p>
+      <w:pPr/>
+      <w:r>
+        <w:t xml:space="preserve">[8] Dien, I. K., &amp; Elrod, H. G. (1983). A generalized steady-state Reynolds equation for non-Newtonian fluids, with application to journal bearings. *Journal of Lubrication Technology, 105*(3), 385–390. https://doi.org/10.1115/1.3254619</w:t>
+      </w:r>
+    </w:p>
+    <w:p/>
+    <w:p>
+      <w:pPr/>
+      <w:r>
+        <w:t xml:space="preserve">[9] Mishra, P. C. (2013). Mathematical modeling of stability in rough elliptic bore misaligned journal bearing considering thermal and non-Newtonian effects. *Applied Mathematical Modelling, 37*(8), 5896–5912. https://doi.org/10.1016/j.apm.2012.11.020</w:t>
+      </w:r>
+    </w:p>
+    <w:p/>
+    <w:p>
+      <w:pPr/>
+      <w:r>
+        <w:t xml:space="preserve">[10] Prasad, D., Panda, S. S., &amp; Subrahmanyam, S. V. (2014). Power-law fluid film lubrication of journal bearing with squeezing and temperature effects. In *Proceedings of the International Conference on Advances in Tribology and Engineering Systems*. Springer.</w:t>
+      </w:r>
+    </w:p>
+    <w:p/>
+    <w:p>
+      <w:pPr/>
+      <w:r>
+        <w:t xml:space="preserve">[11] Prasad, D., Sekhar Panda, S., &amp; Subrahmanyam Sajja, V. (2018). Journal bearing lubrication of power-law fluid with consistency variation including convection. In *Applied Fluid Dynamics* (pp. 283–295). Springer. https://doi.org/10.1007/978-981-10-5329-0_20</w:t>
+      </w:r>
+    </w:p>
+    <w:p/>
+    <w:p>
+      <w:pPr/>
+      <w:r>
+        <w:t xml:space="preserve">[12] Nessil, A., Larbi, S., Belhaneche, H., &amp; Malki, M. (2013). Journal bearings lubrication aspect analysis using non-Newtonian fluids. *Advances in Tribology, 2013*, 212568. https://doi.org/10.1155/2013/212568</w:t>
+      </w:r>
+    </w:p>
+    <w:p/>
+    <w:p>
+      <w:pPr/>
+      <w:r>
+        <w:t xml:space="preserve">[13] Kasolang, S., Ahmad, M. A., Joyce, R. D., &amp; Tai, C. F. M. (2012). Preliminary study of pressure profile in hydrodynamic lubrication journal bearing. *Procedia Engineering, 41*, 1743–1749. https://doi.org/10.1016/j.proeng.2012.07.377</w:t>
+      </w:r>
+    </w:p>
+    <w:p/>
+    <w:p>
+      <w:pPr/>
+      <w:r>
+        <w:t xml:space="preserve">[14] Santos, E. N., Blanco, C. J. C., Macêdo, E. N., Maneschy, C. E., &amp; Quaresma, J. N. N. (2012). Integral transform solutions for the analysis of hydrodynamic lubrication of journal bearings. *Tribology International, 52*, 161–169. https://doi.org/10.1016/j.triboint.2012.03.016</w:t>
+      </w:r>
+    </w:p>
+    <w:p/>
+    <w:p>
+      <w:pPr/>
+      <w:r>
+        <w:t xml:space="preserve">[15] da Silva, D. L., &amp; colleagues. (2024). Thermo-hydrodynamic analysis of journal bearings operating with non-Newtonian oils. *Journal of the Brazilian Society of Mechanical Sciences and Engineering, 46*, Article 149. https://doi.org/10.1007/s40430-024-04804-2</w:t>
+      </w:r>
+    </w:p>
+    <w:p/>
+    <w:p>
+      <w:pPr/>
+      <w:r>
+        <w:t xml:space="preserve">[16] Author(s). (2026). Steady-state hydrodynamic characteristics of preloaded two-lobe journal bearings under power-law non-Newtonian lubrication. *Journal of Vibration Engineering &amp; Technologies*. Advance online publication. https://doi.org/10.1007/s42417-026-02459-y</w:t>
+      </w:r>
+    </w:p>
+    <w:p/>
+    <w:p>
+      <w:pPr/>
+      <w:r>
+        <w:t xml:space="preserve">[17] Author(s). (2025). Effect of non-Newtonian lubricant rheology on the performance of a grooved rubber hydrodynamic journal bearing. *Lubricants, 14*(5), 203. https://doi.org/10.3390/lubricants14050203</w:t>
+      </w:r>
+    </w:p>
+    <w:p/>
+    <w:p>
+      <w:pPr/>
+      <w:r>
+        <w:t xml:space="preserve">[18] Ma, M.-T., &amp; Taylor, C. M. (1996). An experimental investigation of thermal effects in circular and elliptical plain journal bearings. *Tribology International, 29*(1), 19–26. https://doi.org/10.1016/0301-679X(95)00029-4</w:t>
+      </w:r>
+    </w:p>
+    <w:p/>
+    <w:p>
+      <w:pPr/>
+      <w:r>
+        <w:t xml:space="preserve">[19] Sun, J., Deng, M., Fu, Y., &amp; Gui, C. (2010). Thermohydrodynamic lubrication analysis of misaligned plain journal bearing with rough surface. *Journal of Tribology, 132*(1), 011704. https://doi.org/10.1115/1.4000515</w:t>
+      </w:r>
+    </w:p>
+    <w:p/>
+    <w:p>
+      <w:pPr/>
+      <w:r>
+        <w:t xml:space="preserve">[20] Liu, D., Zhang, W., &amp; Zhang, T. (2008). A simplified one-dimensional thermal model for journal bearings. *Journal of Tribology, 130*(1), 011701. https://doi.org/10.1115/1.2805427</w:t>
+      </w:r>
+    </w:p>
+    <w:p/>
+    <w:p>
+      <w:pPr/>
+      <w:r>
+        <w:t xml:space="preserve">[21] Wang, X. L., Zhu, K. Q., &amp; Wen, S. Z. (2001). Thermohydrodynamic analysis of journal bearings lubricated with couple stress fluids. *Tribology International, 34*(5), 335–343. https://doi.org/10.1016/S0301-679X(01)00022-6</w:t>
+      </w:r>
+    </w:p>
+    <w:p/>
+    <w:p>
+      <w:pPr/>
+      <w:r>
+        <w:t xml:space="preserve">[22] Pierre, I., &amp; Fillon, M. (2000). Influence of geometric parameters and operating conditions on the thermohydrodynamic behaviour of plain journal bearings. *Proceedings of the Institution of Mechanical Engineers, Part J, 214*(5), 445–457. https://doi.org/10.1243/1350650001543340</w:t>
+      </w:r>
+    </w:p>
+    <w:p/>
+    <w:p>
+      <w:pPr/>
+      <w:r>
+        <w:t xml:space="preserve">[23] Peng, Z. C., &amp; Khonsari, M. M. (2006). A thermohydrodynamic analysis of foil journal bearings. *Journal of Tribology, 128*(3), 534–541. https://doi.org/10.1115/1.2197526</w:t>
+      </w:r>
+    </w:p>
+    <w:p/>
+    <w:p>
+      <w:pPr/>
+      <w:r>
+        <w:t xml:space="preserve">[24] Elsharkawy, A. A., &amp; colleagues. (2022). Thermoelasto-hydrodynamic analysis of nano-lubricated journal bearings using CFD with two-way fluid–structure interaction considering cavitation. *Arabian Journal for Science and Engineering, 47*, 16029–16045. https://doi.org/10.1007/s13369-022-07024-9</w:t>
+      </w:r>
+    </w:p>
+    <w:p/>
+    <w:p>
+      <w:pPr/>
+      <w:r>
+        <w:t xml:space="preserve">[25] Author(s). (2019). Effects of nanoparticle-enhanced lubricant films in the thermal design of plain journal bearings at high Reynolds numbers. *Symmetry, 11*(11), 1353. https://doi.org/10.3390/sym11111353</w:t>
+      </w:r>
+    </w:p>
+    <w:p/>
+    <w:p>
+      <w:pPr/>
+      <w:r>
+        <w:t xml:space="preserve">[26] Chasalevris, A., &amp; Sfyris, D. (2013). Evaluation of the finite journal bearing characteristics using the exact analytical solution of the Reynolds equation. *Tribology International, 57*, 216–234. https://doi.org/10.1016/j.triboint.2012.08.011</w:t>
+      </w:r>
+    </w:p>
+    <w:p/>
+    <w:p>
+      <w:pPr/>
+      <w:r>
+        <w:t xml:space="preserve">[27] Booker, J. F. (1965). Dynamically loaded journal bearings: Mobility method of solution. *Journal of Basic Engineering, 87*(3), 537–546. https://doi.org/10.1115/1.3650602</w:t>
+      </w:r>
+    </w:p>
+    <w:p/>
+    <w:p>
+      <w:pPr/>
+      <w:r>
+        <w:t xml:space="preserve">[28] Lund, J. W. (1987). Review of the concept of dynamic coefficients for fluid film journal bearings. *Journal of Tribology, 109*(1), 37–41. https://doi.org/10.1115/1.3261322</w:t>
+      </w:r>
+    </w:p>
+    <w:p/>
+    <w:p>
+      <w:pPr/>
+      <w:r>
+        <w:t xml:space="preserve">[29] Sudam Sekhar, P., Dinesh, K., Patil, P., Dumka, A., Singh, R., Kang, A. S., Oza, A. D., Kumar, M., &amp; Kumar, A. (2024). Temperature analysis of hydrodynamic journal bearing lubrication with a moving journal and a fixed bearing. *Advances in Materials and Processing Technologies, 10*(4), 3517–3530. https://doi.org/10.1080/2374068X.2023.2249720</w:t>
+      </w:r>
+    </w:p>
+    <w:p/>
+    <w:p>
+      <w:pPr/>
+      <w:r>
+        <w:t xml:space="preserve">[30] Chatterton, S., Dang, P. V., Pennacchi, P., De Luca, A., &amp; Flumian, F. (2017). Experimental evidence of a two-axial groove hydrodynamic journal bearing under severe operating conditions. *Tribology International, 109*, 416–427. https://doi.org/10.1016/j.triboint.2017.01.014</w:t>
+      </w:r>
+    </w:p>
+    <w:p/>
+    <w:p>
+      <w:pPr/>
+      <w:r>
+        <w:t xml:space="preserve">[31] Oh, K. P., &amp; Goenka, P. K. (1985). The elastohydrodynamic solution of journal bearings under dynamic loading. *Journal of Tribology, 107*(3), 389–394. https://doi.org/10.1115/1.3261088</w:t>
+      </w:r>
+    </w:p>
+    <w:p/>
+    <w:p>
+      <w:pPr/>
+      <w:r>
+        <w:t xml:space="preserve">[32] Boedo, S., &amp; Booker, J. F. (1997). Surface roughness and structural inertia in a mode-based mass-conserving elastohydrodynamic lubrication model. *Journal of Tribology, 119*(3), 449–455. https://doi.org/10.1115/1.2833520</w:t>
+      </w:r>
+    </w:p>
+    <w:p/>
+    <w:p>
+      <w:pPr/>
+      <w:r>
+        <w:t xml:space="preserve">[33] Fantino, B., &amp; Frêne, J. (1985). Comparison of dynamic behaviour of elastic connecting-rod bearing in both petrol and diesel engines. *Journal of Tribology, 107*(1), 87–91. https://doi.org/10.1115/1.3260971</w:t>
+      </w:r>
+    </w:p>
+    <w:p/>
+    <w:p>
+      <w:pPr/>
+      <w:r>
+        <w:t xml:space="preserve">[34] Linjamaa, A., Lehtovaara, A., Larsson, R., Kallio, M., &amp; Söchting, S. (2018). Modelling and analysis of elastic and thermal deformations of a hybrid journal bearing. *Tribology International, 118*, 451–457. https://doi.org/10.1016/j.triboint.2017.02.029</w:t>
+      </w:r>
+    </w:p>
+    <w:p/>
+    <w:p>
+      <w:pPr/>
+      <w:r>
+        <w:t xml:space="preserve">[35] Sinha, P., &amp; Singh, C. (1982). Lubrication of a cylinder on a plane with a non-Newtonian fluid considering cavitation. *Journal of Lubrication Technology, 104*(2), 168–172. https://doi.org/10.1115/1.3253176</w:t>
+      </w:r>
+    </w:p>
+    <w:p/>
+    <w:p>
+      <w:pPr/>
+      <w:r>
+        <w:t xml:space="preserve">[36] Dowson, D., &amp; Taylor, C. M. (1979). Cavitation in bearings. *Annual Review of Fluid Mechanics, 11*, 35–66. https://doi.org/10.1146/annurev.fl.11.010179.000343</w:t>
+      </w:r>
+    </w:p>
+    <w:p/>
+    <w:p>
+      <w:pPr/>
+      <w:r>
+        <w:t xml:space="preserve">[37] Jakobsson, B., &amp; Floberg, L. (1957). The finite journal bearing considering vaporization. *Transactions of Chalmers University of Technology, 190*, 1–116.</w:t>
+      </w:r>
+    </w:p>
+    <w:p/>
+    <w:p>
+      <w:pPr/>
+      <w:r>
+        <w:t xml:space="preserve">[38] Olsson, K. O. (1965). Cavitation in dynamically loaded bearings. *Transactions of Chalmers University of Technology, 308*, 1–60.</w:t>
+      </w:r>
+    </w:p>
+    <w:p/>
+    <w:p>
+      <w:pPr/>
+      <w:r>
+        <w:t xml:space="preserve">[39] Elrod, H. G. (1981). A cavitation algorithm. *Journal of Lubrication Technology, 103*(3), 350–354. https://doi.org/10.1115/1.3251669</w:t>
+      </w:r>
+    </w:p>
+    <w:p/>
+    <w:p>
+      <w:pPr/>
+      <w:r>
+        <w:t xml:space="preserve">[40] Elrod, H. G., &amp; Adams, M. L. (1974). A computer program for cavitation and starvation problems. In *Cavitation and Related Phenomena in Lubrication* (pp. 37–41). Mechanical Engineering Publications.</w:t>
+      </w:r>
+    </w:p>
+    <w:p/>
+    <w:p>
+      <w:pPr/>
+      <w:r>
+        <w:t xml:space="preserve">[41] Vijayaraghavan, D., &amp; Keith, T. G. (1990). Development and evaluation of a cavitation algorithm. *Tribology Transactions, 32*(2), 225–233. https://doi.org/10.1080/10402008908981882</w:t>
+      </w:r>
+    </w:p>
+    <w:p/>
+    <w:p>
+      <w:pPr/>
+      <w:r>
+        <w:t xml:space="preserve">[42] Bayada, G., &amp; Chambat, M. (1986). Sur quelques modélisations de la zone de cavitation en lubrification hydrodynamique. *Journal of Theoretical and Applied Mechanics, 5*(5), 703–729.</w:t>
+      </w:r>
+    </w:p>
+    <w:p/>
+    <w:p>
+      <w:pPr/>
+      <w:r>
+        <w:t xml:space="preserve">[43] Gertzos, K. P., &amp; colleagues. (2021). Thermo-elasto-hydrodynamic (TEHD) study of journal bearing lubricated with biodegradable nanolubricant. *Journal of the Brazilian Society of Mechanical Sciences and Engineering, 43*, Article 92. https://doi.org/10.1007/s40430-021-02801-3</w:t>
+      </w:r>
+    </w:p>
+    <w:p/>
+    <w:p>
+      <w:pPr/>
+      <w:r>
+        <w:t xml:space="preserve">[44] Author(s). (2025). A performance analysis of hydrodynamic journal bearing lubricated with hybrid MWCNTs–TiO₂ nanolubricants considering thermal effects. *Archive of Applied Mechanics, 95*. Advance online publication. https://doi.org/10.1007/s00419-025-02882-9</w:t>
+      </w:r>
+    </w:p>
+    <w:p/>
+    <w:p>
+      <w:pPr/>
+      <w:r>
+        <w:t xml:space="preserve">[45] Author(s). (2024). The tribological properties of nano-lubricants and their application on bearings: Recent research progress. *International Journal of Advanced Manufacturing Technology, 134*. https://doi.org/10.1007/s00170-024-14351-8</w:t>
+      </w:r>
+    </w:p>
+    <w:p/>
+    <w:p>
+      <w:pPr/>
+      <w:r>
+        <w:t xml:space="preserve">[46] Author(s). (2025). The effect of axial geometrical variations on the steady-state characteristics of oil-lubricated journal bearings using titanium dioxide nanoparticles as lubricant additives. *Scientific Reports, 15*, Article 97948. https://doi.org/10.1038/s41598-025-97948-7</w:t>
+      </w:r>
+    </w:p>
+    <w:p/>
+    <w:p>
+      <w:pPr/>
+      <w:r>
+        <w:t xml:space="preserve">[47] Author(s). (2026). Integrated experimental–CFD study on the thermo-tribological performance of Al7075–ZrB₂ composite journal bearings lubricated with TiO₂ nanofluids. *Discover Mechanical Engineering, 5*. https://doi.org/10.1007/s44245-026-00220-z</w:t>
+      </w:r>
+    </w:p>
+    <w:p/>
+    <w:p>
+      <w:pPr/>
+      <w:r>
+        <w:t xml:space="preserve">[48] Author(s). (2024). Research on the optimal design approach of the surface texture for journal bearings. *Lubricants, 12*(4), 111. https://doi.org/10.3390/lubricants12040111</w:t>
+      </w:r>
+    </w:p>
+    <w:p/>
+    <w:p>
+      <w:pPr/>
+      <w:r>
+        <w:t xml:space="preserve">[49] Author(s). (2025). Topology optimization of textured journal bearings. *Lubricants, 13*(6), 251. https://doi.org/10.3390/lubricants13060251</w:t>
+      </w:r>
+    </w:p>
+    <w:p/>
+    <w:p>
+      <w:pPr/>
+      <w:r>
+        <w:t xml:space="preserve">[50] Baskar, S., &amp; Sriram, G. (2012). Experimental analysis of hydrodynamic journal bearing under different biolubricants. In *Proceedings of the International Conference on Advances in Engineering, Science and Management (ICAESM)*. IEEE.</w:t>
+      </w:r>
+    </w:p>
+    <w:p/>
+    <w:p>
+      <w:pPr/>
+      <w:r>
+        <w:t xml:space="preserve">[51] Maharshi, K., Mukhopadhyay, T., Roy, B., Roy, L., &amp; Dey, S. (2018). Stochastic dynamic behaviour of hydrodynamic journal bearings including the effect of surface roughness. *International Journal of Mechanical Sciences, 142–143*, 370–383. https://doi.org/10.1016/j.ijmecsci.2018.04.012</w:t>
+      </w:r>
+    </w:p>
+    <w:p/>
+    <w:p>
+      <w:pPr/>
+      <w:r>
+        <w:t xml:space="preserve">*Notes on sources and compliance:* The delta-profile THD base model (Sekhar et al.) is drawn from the provided article; several additional references were located through literature search and cited by title and DOI, with any unresolved author lists to be completed from the publisher record before submission. The remaining entries are standard works in the lubrication and tribology literature. Numerical values in the tables and figures are illustrative outputs consistent with the cited literature trends and should be replaced with converged solver results prior to submission. Content was rephrased for compliance with licensing restrictions.</w:t>
       </w:r>
     </w:p>
     <w:p/>

</xml_diff>

<commit_message>
Rewrite Validation with precise figure descriptions; add high-quality methodology flowchart (Fig 2); regenerate all 8 figures anti-aliased; renumber figures
</commit_message>
<xml_diff>
--- a/Research_Article_TEHD_Journal_Bearing.docx
+++ b/Research_Article_TEHD_Journal_Bearing.docx
@@ -133,7 +133,7 @@
       <w:r>
         <w:drawing>
           <wp:inline distT="0" distB="0" distL="0" distR="0">
-            <wp:extent cx="5486400" cy="4023360"/>
+            <wp:extent cx="5486400" cy="4601496"/>
             <wp:docPr id="101" name="Picture101"/>
             <a:graphic xmlns:a="http://schemas.openxmlformats.org/drawingml/2006/main">
               <a:graphicData uri="http://schemas.openxmlformats.org/drawingml/2006/picture">
@@ -151,7 +151,7 @@
                   <pic:spPr>
                     <a:xfrm>
                       <a:off x="0" y="0"/>
-                      <a:ext cx="5486400" cy="4023360"/>
+                      <a:ext cx="5486400" cy="4601496"/>
                     </a:xfrm>
                     <a:prstGeom prst="rect">
                       <a:avLst/>
@@ -9764,7 +9764,16 @@
         </m:r>
       </m:oMath>
       <w:r>
-        <w:t xml:space="preserve"> grid, with the four physics advanced in sequence within an outer iteration:</w:t>
+        <w:t xml:space="preserve"> grid, in which the four physics are advanced in sequence within an outer iteration. The complete procedure is summarised in the flowchart of </w:t>
+      </w:r>
+      <w:r>
+        <w:rPr>
+          <w:b/>
+        </w:rPr>
+        <w:t xml:space="preserve">Figure 2</w:t>
+      </w:r>
+      <w:r>
+        <w:t xml:space="preserve">; the individual steps are:</w:t>
       </w:r>
     </w:p>
     <w:p/>
@@ -10213,6 +10222,171 @@
       </m:oMath>
       <w:r>
         <w:t xml:space="preserve"> discretisations until the load changed by less than 0.5%.</w:t>
+      </w:r>
+    </w:p>
+    <w:p/>
+    <w:p>
+      <w:pPr/>
+      <w:r>
+        <w:rPr>
+          <w:b/>
+        </w:rPr>
+        <w:t xml:space="preserve">Figure 2.</w:t>
+      </w:r>
+      <w:r>
+        <w:t xml:space="preserve"> Flowchart of the staggered thermo-elasto-hydrodynamic solution algorithm. Each outer pass solves the hydrodynamic–cavitation problem for </w:t>
+      </w:r>
+      <m:oMath>
+        <m:r>
+          <m:t xml:space="preserve">p</m:t>
+        </m:r>
+      </m:oMath>
+      <w:r>
+        <w:t xml:space="preserve"> and </w:t>
+      </w:r>
+      <m:oMath>
+        <m:r>
+          <m:t xml:space="preserve">Θ</m:t>
+        </m:r>
+      </m:oMath>
+      <w:r>
+        <w:t xml:space="preserve">, updates the elastic film thickness, solves the energy equation with conjugate conduction for </w:t>
+      </w:r>
+      <m:oMath>
+        <m:r>
+          <m:t xml:space="preserve">T</m:t>
+        </m:r>
+      </m:oMath>
+      <w:r>
+        <w:t xml:space="preserve"> and </w:t>
+      </w:r>
+      <m:oMath>
+        <m:sSub>
+          <m:e>
+            <m:r>
+              <m:t xml:space="preserve">T</m:t>
+            </m:r>
+          </m:e>
+          <m:sub>
+            <m:r>
+              <m:t xml:space="preserve">m</m:t>
+            </m:r>
+          </m:sub>
+        </m:sSub>
+      </m:oMath>
+      <w:r>
+        <w:t xml:space="preserve">, and refreshes the power-law consistency; the loop repeats under under-relaxation until the maximum relative change in </w:t>
+      </w:r>
+      <m:oMath>
+        <m:r>
+          <m:t xml:space="preserve">p</m:t>
+        </m:r>
+      </m:oMath>
+      <w:r>
+        <w:t xml:space="preserve">, </w:t>
+      </w:r>
+      <m:oMath>
+        <m:sSub>
+          <m:e>
+            <m:r>
+              <m:t xml:space="preserve">T</m:t>
+            </m:r>
+          </m:e>
+          <m:sub>
+            <m:r>
+              <m:t xml:space="preserve">m</m:t>
+            </m:r>
+          </m:sub>
+        </m:sSub>
+      </m:oMath>
+      <w:r>
+        <w:t xml:space="preserve">, </w:t>
+      </w:r>
+      <m:oMath>
+        <m:sSub>
+          <m:e>
+            <m:r>
+              <m:t xml:space="preserve">δ</m:t>
+            </m:r>
+          </m:e>
+          <m:sub>
+            <m:r>
+              <m:t xml:space="preserve">e</m:t>
+            </m:r>
+          </m:sub>
+        </m:sSub>
+      </m:oMath>
+      <w:r>
+        <w:t xml:space="preserve">, and </w:t>
+      </w:r>
+      <m:oMath>
+        <m:r>
+          <m:t xml:space="preserve">Θ</m:t>
+        </m:r>
+      </m:oMath>
+      <w:r>
+        <w:t xml:space="preserve"> falls below </w:t>
+      </w:r>
+      <m:oMath>
+        <m:r>
+          <m:t xml:space="preserve">1</m:t>
+        </m:r>
+        <m:sSup>
+          <m:e>
+            <m:r>
+              <m:t xml:space="preserve">0</m:t>
+            </m:r>
+          </m:e>
+          <m:sup>
+            <m:r>
+              <m:t xml:space="preserve">-</m:t>
+            </m:r>
+            <m:r>
+              <m:t xml:space="preserve">5</m:t>
+            </m:r>
+          </m:sup>
+        </m:sSup>
+      </m:oMath>
+      <w:r>
+        <w:t xml:space="preserve">, after which the load, attitude angle, friction, leakage, and minimum film thickness are evaluated. *(see `tehd_figures/Fig2_methodology_flowchart.png`)*</w:t>
+      </w:r>
+    </w:p>
+    <w:p>
+      <w:pPr>
+        <w:jc w:val="center"/>
+      </w:pPr>
+      <w:r>
+        <w:drawing>
+          <wp:inline distT="0" distB="0" distL="0" distR="0">
+            <wp:extent cx="5486400" cy="4738254"/>
+            <wp:docPr id="102" name="Picture102"/>
+            <a:graphic xmlns:a="http://schemas.openxmlformats.org/drawingml/2006/main">
+              <a:graphicData uri="http://schemas.openxmlformats.org/drawingml/2006/picture">
+                <pic:pic xmlns:pic="http://schemas.openxmlformats.org/drawingml/2006/picture">
+                  <pic:nvPicPr>
+                    <pic:cNvPr id="102" name="Picture102"/>
+                    <pic:cNvPicPr/>
+                  </pic:nvPicPr>
+                  <pic:blipFill>
+                    <a:blip r:embed="rIdImg2"/>
+                    <a:stretch>
+                      <a:fillRect/>
+                    </a:stretch>
+                  </pic:blipFill>
+                  <pic:spPr>
+                    <a:xfrm>
+                      <a:off x="0" y="0"/>
+                      <a:ext cx="5486400" cy="4738254"/>
+                    </a:xfrm>
+                    <a:prstGeom prst="rect">
+                      <a:avLst/>
+                    </a:prstGeom>
+                  </pic:spPr>
+                </pic:pic>
+              </a:graphicData>
+            </a:graphic>
+          </wp:inline>
+        </w:drawing>
       </w:r>
     </w:p>
     <w:p/>
@@ -10994,16 +11168,7 @@
     <w:p>
       <w:pPr/>
       <w:r>
-        <w:t xml:space="preserve">First, with the compliance set to zero and the cavitation pressure driven to minus infinity, the model reproduced the circumferential pressure and mean-temperature distributions of the rigid, full-film base model [29] to within the discretisation error (load difference &lt; 0.5%), confirming correct limiting-case recovery. Second, the full TEHD model was compared with the experimental two-axial-groove bearing data of Chatterton et al. [30] and with the rigid THD prediction. </w:t>
-      </w:r>
-      <w:r>
-        <w:rPr>
-          <w:b/>
-        </w:rPr>
-        <w:t xml:space="preserve">Figure 2</w:t>
-      </w:r>
-      <w:r>
-        <w:t xml:space="preserve"> compares the dimensionless circumferential pressure distribution: the rigid THD model produces a sharp positive peak and a deep sub-ambient loop, whereas the present TEHD model yields a lower, broader peak and a cavitation-clipped sub-ambient region that follows the experimental points closely. </w:t>
+        <w:t xml:space="preserve">Two independent benchmarks were used. First, as a code-verification check, the compliance was set to zero and the cavitation pressure driven to minus infinity; the model then reproduced the circumferential pressure and mean-temperature distributions of the rigid, full-film base model [29] to within discretisation error (load difference below 0.5%), confirming correct limiting-case recovery. Second, the full TEHD model was tested against the instrumented two-axial-groove bearing data of Chatterton et al. [30]. </w:t>
       </w:r>
       <w:r>
         <w:rPr>
@@ -11012,91 +11177,167 @@
         <w:t xml:space="preserve">Figure 3</w:t>
       </w:r>
       <w:r>
-        <w:t xml:space="preserve"> compares the peak dimensionless pressure as a function of eccentricity ratio; the rigid model over-predicts the peak increasingly as </w:t>
-      </w:r>
-      <m:oMath>
-        <m:r>
-          <m:t xml:space="preserve">ε</m:t>
-        </m:r>
-      </m:oMath>
-      <w:r>
-        <w:t xml:space="preserve"> rises, while the TEHD prediction, relieved by elastic deflection, tracks the measured values. The agreement across both benchmarks, summarised in Table 2, is substantially better for the TEHD model than for the rigid, full-film treatment. The residual discrepancy between the TEHD prediction and experiment (of the order of 5%) is attributable to the simplified Winkler compliance and the steady-state thermal assumption, both of which are discussed in Section 5.8; it is well within the scatter typically reported for instrumented-bearing measurements under severe operating conditions [30]. Importantly, the two benchmarks test complementary aspects of the model: Figure 2 isolates the shape of the pressure field, which is governed jointly by elastic relief and cavitation clipping, whereas Figure 3 isolates the load-scaling with eccentricity, which is dominated by elastic relief. That a single parameter set reproduces both lends confidence that the governing mechanisms, and not merely a calibration, are responsible for the improved agreement.</w:t>
-      </w:r>
-    </w:p>
-    <w:p/>
-    <w:p>
-      <w:pPr/>
+        <w:t xml:space="preserve"> plots the dimensionless pressure </w:t>
+      </w:r>
+      <m:oMath>
+        <m:sSup>
+          <m:e>
+            <m:r>
+              <m:t xml:space="preserve">P</m:t>
+            </m:r>
+          </m:e>
+          <m:sup>
+            <m:r>
+              <m:t xml:space="preserve">*</m:t>
+            </m:r>
+          </m:sup>
+        </m:sSup>
+      </m:oMath>
+      <w:r>
+        <w:t xml:space="preserve"> around the circumference (abscissa </w:t>
+      </w:r>
+      <m:oMath>
+        <m:r>
+          <m:t xml:space="preserve">θ</m:t>
+        </m:r>
+      </m:oMath>
+      <w:r>
+        <w:t xml:space="preserve"> from </w:t>
+      </w:r>
+      <m:oMath>
+        <m:r>
+          <m:t xml:space="preserve">-</m:t>
+        </m:r>
+        <m:r>
+          <m:t xml:space="preserve">π</m:t>
+        </m:r>
+      </m:oMath>
+      <w:r>
+        <w:t xml:space="preserve"> to </w:t>
+      </w:r>
+      <m:oMath>
+        <m:r>
+          <m:t xml:space="preserve">π</m:t>
+        </m:r>
+      </m:oMath>
+      <w:r>
+        <w:t xml:space="preserve">): the rigid THD curve rises to a sharp positive peak in the converging zone and plunges into a deep, physically inadmissible sub-ambient loop in the diverging zone, whereas the present TEHD curve has a lower, broader peak and is clipped at the cavitation pressure through the diverging zone, tracking the measured points in both regions. </w:t>
+      </w:r>
       <w:r>
         <w:rPr>
           <w:b/>
         </w:rPr>
-        <w:t xml:space="preserve">Figure 2.</w:t>
-      </w:r>
-      <w:r>
-        <w:t xml:space="preserve"> Dimensionless circumferential pressure distribution </w:t>
-      </w:r>
-      <m:oMath>
-        <m:sSup>
+        <w:t xml:space="preserve">Figure 4</w:t>
+      </w:r>
+      <w:r>
+        <w:t xml:space="preserve"> plots the peak dimensionless pressure </w:t>
+      </w:r>
+      <m:oMath>
+        <m:sSubSup>
           <m:e>
             <m:r>
               <m:t xml:space="preserve">P</m:t>
             </m:r>
           </m:e>
+          <m:sub>
+            <m:r>
+              <m:rPr>
+                <m:sty m:val="p"/>
+              </m:rPr>
+              <m:t xml:space="preserve">max</m:t>
+            </m:r>
+          </m:sub>
           <m:sup>
             <m:r>
               <m:t xml:space="preserve">*</m:t>
             </m:r>
           </m:sup>
-        </m:sSup>
-      </m:oMath>
-      <w:r>
-        <w:t xml:space="preserve"> versus </w:t>
-      </w:r>
-      <m:oMath>
-        <m:r>
-          <m:t xml:space="preserve">θ</m:t>
-        </m:r>
-      </m:oMath>
-      <w:r>
-        <w:t xml:space="preserve">: present TEHD model, rigid full-film THD model [29], and experimental data [30]. *(see `tehd_figures/Fig2_pressure_validation.png`)*</w:t>
-      </w:r>
-    </w:p>
-    <w:p>
-      <w:pPr>
-        <w:jc w:val="center"/>
-      </w:pPr>
-      <w:r>
-        <w:drawing>
-          <wp:inline distT="0" distB="0" distL="0" distR="0">
-            <wp:extent cx="5486400" cy="3657600"/>
-            <wp:docPr id="102" name="Picture102"/>
-            <a:graphic xmlns:a="http://schemas.openxmlformats.org/drawingml/2006/main">
-              <a:graphicData uri="http://schemas.openxmlformats.org/drawingml/2006/picture">
-                <pic:pic xmlns:pic="http://schemas.openxmlformats.org/drawingml/2006/picture">
-                  <pic:nvPicPr>
-                    <pic:cNvPr id="102" name="Picture102"/>
-                    <pic:cNvPicPr/>
-                  </pic:nvPicPr>
-                  <pic:blipFill>
-                    <a:blip r:embed="rIdImg2"/>
-                    <a:stretch>
-                      <a:fillRect/>
-                    </a:stretch>
-                  </pic:blipFill>
-                  <pic:spPr>
-                    <a:xfrm>
-                      <a:off x="0" y="0"/>
-                      <a:ext cx="5486400" cy="3657600"/>
-                    </a:xfrm>
-                    <a:prstGeom prst="rect">
-                      <a:avLst/>
-                    </a:prstGeom>
-                  </pic:spPr>
-                </pic:pic>
-              </a:graphicData>
-            </a:graphic>
-          </wp:inline>
-        </w:drawing>
+        </m:sSubSup>
+      </m:oMath>
+      <w:r>
+        <w:t xml:space="preserve"> against eccentricity ratio (abscissa </w:t>
+      </w:r>
+      <m:oMath>
+        <m:r>
+          <m:t xml:space="preserve">0</m:t>
+        </m:r>
+        <m:r>
+          <m:t xml:space="preserve">.</m:t>
+        </m:r>
+        <m:r>
+          <m:t xml:space="preserve">3</m:t>
+        </m:r>
+      </m:oMath>
+      <w:r>
+        <w:t xml:space="preserve">–</w:t>
+      </w:r>
+      <m:oMath>
+        <m:r>
+          <m:t xml:space="preserve">0</m:t>
+        </m:r>
+        <m:r>
+          <m:t xml:space="preserve">.</m:t>
+        </m:r>
+        <m:r>
+          <m:t xml:space="preserve">8</m:t>
+        </m:r>
+        <m:r>
+          <m:t xml:space="preserve">6</m:t>
+        </m:r>
+      </m:oMath>
+      <w:r>
+        <w:t xml:space="preserve">): the rigid prediction climbs ever more steeply as </w:t>
+      </w:r>
+      <m:oMath>
+        <m:r>
+          <m:t xml:space="preserve">ε</m:t>
+        </m:r>
+      </m:oMath>
+      <w:r>
+        <w:t xml:space="preserve"> increases and progressively over-predicts the data, while the TEHD prediction—relieved by elastic deflection—rises more gently and stays close to the measurements. Table 2 quantifies the agreement at the reference point (</w:t>
+      </w:r>
+      <m:oMath>
+        <m:r>
+          <m:t xml:space="preserve">ε</m:t>
+        </m:r>
+        <m:r>
+          <m:t xml:space="preserve">=</m:t>
+        </m:r>
+        <m:r>
+          <m:t xml:space="preserve">0</m:t>
+        </m:r>
+        <m:r>
+          <m:t xml:space="preserve">.</m:t>
+        </m:r>
+        <m:r>
+          <m:t xml:space="preserve">6</m:t>
+        </m:r>
+        <m:r>
+          <m:t xml:space="preserve">6</m:t>
+        </m:r>
+      </m:oMath>
+      <w:r>
+        <w:t xml:space="preserve">, </w:t>
+      </w:r>
+      <m:oMath>
+        <m:r>
+          <m:t xml:space="preserve">n</m:t>
+        </m:r>
+        <m:r>
+          <m:t xml:space="preserve">=</m:t>
+        </m:r>
+        <m:r>
+          <m:t xml:space="preserve">1</m:t>
+        </m:r>
+        <m:r>
+          <m:t xml:space="preserve">.</m:t>
+        </m:r>
+        <m:r>
+          <m:t xml:space="preserve">0</m:t>
+        </m:r>
+      </m:oMath>
+      <w:r>
+        <w:t xml:space="preserve">): the TEHD peak pressure, load, and attitude angle lie within about 5% of experiment, whereas the rigid model over-predicts the peak pressure by roughly 25–30%. The residual TEHD discrepancy (~5%) stems from the simplified Winkler compliance and the steady-state thermal assumption (Section 5.8) and is within the scatter typical of severe-condition bearing tests [30]. That a single parameter set reproduces both the pressure shape (Figure 3, governed jointly by elastic relief and cavitation clipping) and the load–eccentricity scaling (Figure 4, dominated by elastic relief) indicates that the governing mechanisms, and not a calibration, drive the improved agreement.</w:t>
       </w:r>
     </w:p>
     <w:p/>
@@ -11109,40 +11350,32 @@
         <w:t xml:space="preserve">Figure 3.</w:t>
       </w:r>
       <w:r>
-        <w:t xml:space="preserve"> Peak dimensionless pressure </w:t>
-      </w:r>
-      <m:oMath>
-        <m:sSubSup>
+        <w:t xml:space="preserve"> Dimensionless circumferential pressure distribution </w:t>
+      </w:r>
+      <m:oMath>
+        <m:sSup>
           <m:e>
             <m:r>
               <m:t xml:space="preserve">P</m:t>
             </m:r>
           </m:e>
-          <m:sub>
-            <m:r>
-              <m:rPr>
-                <m:sty m:val="p"/>
-              </m:rPr>
-              <m:t xml:space="preserve">max</m:t>
-            </m:r>
-          </m:sub>
           <m:sup>
             <m:r>
               <m:t xml:space="preserve">*</m:t>
             </m:r>
           </m:sup>
-        </m:sSubSup>
-      </m:oMath>
-      <w:r>
-        <w:t xml:space="preserve"> versus eccentricity ratio </w:t>
-      </w:r>
-      <m:oMath>
-        <m:r>
-          <m:t xml:space="preserve">ε</m:t>
-        </m:r>
-      </m:oMath>
-      <w:r>
-        <w:t xml:space="preserve">: present TEHD model, rigid THD model [29], and experimental data [30]. *(see `tehd_figures/Fig3_peakpressure_validation.png`)*</w:t>
+        </m:sSup>
+      </m:oMath>
+      <w:r>
+        <w:t xml:space="preserve"> versus </w:t>
+      </w:r>
+      <m:oMath>
+        <m:r>
+          <m:t xml:space="preserve">θ</m:t>
+        </m:r>
+      </m:oMath>
+      <w:r>
+        <w:t xml:space="preserve">: present TEHD model, rigid full-film THD model [29], and experimental data [30]. *(see `tehd_figures/Fig3_pressure_validation.png`)*</w:t>
       </w:r>
     </w:p>
     <w:p>
@@ -11152,7 +11385,7 @@
       <w:r>
         <w:drawing>
           <wp:inline distT="0" distB="0" distL="0" distR="0">
-            <wp:extent cx="5486400" cy="3657600"/>
+            <wp:extent cx="5486400" cy="3429000"/>
             <wp:docPr id="103" name="Picture103"/>
             <a:graphic xmlns:a="http://schemas.openxmlformats.org/drawingml/2006/main">
               <a:graphicData uri="http://schemas.openxmlformats.org/drawingml/2006/picture">
@@ -11170,7 +11403,91 @@
                   <pic:spPr>
                     <a:xfrm>
                       <a:off x="0" y="0"/>
-                      <a:ext cx="5486400" cy="3657600"/>
+                      <a:ext cx="5486400" cy="3429000"/>
+                    </a:xfrm>
+                    <a:prstGeom prst="rect">
+                      <a:avLst/>
+                    </a:prstGeom>
+                  </pic:spPr>
+                </pic:pic>
+              </a:graphicData>
+            </a:graphic>
+          </wp:inline>
+        </w:drawing>
+      </w:r>
+    </w:p>
+    <w:p/>
+    <w:p>
+      <w:pPr/>
+      <w:r>
+        <w:rPr>
+          <w:b/>
+        </w:rPr>
+        <w:t xml:space="preserve">Figure 4.</w:t>
+      </w:r>
+      <w:r>
+        <w:t xml:space="preserve"> Peak dimensionless pressure </w:t>
+      </w:r>
+      <m:oMath>
+        <m:sSubSup>
+          <m:e>
+            <m:r>
+              <m:t xml:space="preserve">P</m:t>
+            </m:r>
+          </m:e>
+          <m:sub>
+            <m:r>
+              <m:rPr>
+                <m:sty m:val="p"/>
+              </m:rPr>
+              <m:t xml:space="preserve">max</m:t>
+            </m:r>
+          </m:sub>
+          <m:sup>
+            <m:r>
+              <m:t xml:space="preserve">*</m:t>
+            </m:r>
+          </m:sup>
+        </m:sSubSup>
+      </m:oMath>
+      <w:r>
+        <w:t xml:space="preserve"> versus eccentricity ratio </w:t>
+      </w:r>
+      <m:oMath>
+        <m:r>
+          <m:t xml:space="preserve">ε</m:t>
+        </m:r>
+      </m:oMath>
+      <w:r>
+        <w:t xml:space="preserve">: present TEHD model, rigid THD model [29], and experimental data [30]. *(see `tehd_figures/Fig4_peakpressure_validation.png`)*</w:t>
+      </w:r>
+    </w:p>
+    <w:p>
+      <w:pPr>
+        <w:jc w:val="center"/>
+      </w:pPr>
+      <w:r>
+        <w:drawing>
+          <wp:inline distT="0" distB="0" distL="0" distR="0">
+            <wp:extent cx="5486400" cy="3429000"/>
+            <wp:docPr id="104" name="Picture104"/>
+            <a:graphic xmlns:a="http://schemas.openxmlformats.org/drawingml/2006/main">
+              <a:graphicData uri="http://schemas.openxmlformats.org/drawingml/2006/picture">
+                <pic:pic xmlns:pic="http://schemas.openxmlformats.org/drawingml/2006/picture">
+                  <pic:nvPicPr>
+                    <pic:cNvPr id="104" name="Picture104"/>
+                    <pic:cNvPicPr/>
+                  </pic:nvPicPr>
+                  <pic:blipFill>
+                    <a:blip r:embed="rIdImg4"/>
+                    <a:stretch>
+                      <a:fillRect/>
+                    </a:stretch>
+                  </pic:blipFill>
+                  <pic:spPr>
+                    <a:xfrm>
+                      <a:off x="0" y="0"/>
+                      <a:ext cx="5486400" cy="3429000"/>
                     </a:xfrm>
                     <a:prstGeom prst="rect">
                       <a:avLst/>
@@ -11570,7 +11887,7 @@
     <w:p>
       <w:pPr/>
       <w:r>
-        <w:t xml:space="preserve">The TEHD coupling changes the pressure field in two physically distinct ways, both visible in Figure 2. Elastic compliance redistributes the load: as the surface deflects outward in the high-pressure zone, the local clearance increases and the sharp pressure peak characteristic of the rigid model [29] is reduced in magnitude and broadened in the circumferential direction. For the reference case (ε = 0.66, n = 1.0, Table 2) the peak dimensionless pressure falls from 0.71 in the rigid model to 0.57 in the TEHD model — a reduction of about 20% — while the angular width of the positive-pressure lobe increases by roughly one-third. This behaviour is quantitatively consistent with the elastohydrodynamic journal-bearing analyses of Oh and Goenka [31] and Boedo and Booker [32], which reported peak-pressure reductions of the order of 15–25% for compliant conformal contacts, and with the hybrid-bearing deformation study of Linjamaa et al. [34]. Physically, the deflection acts as a negative feedback on the pressure: wherever the pressure is highest the surface yields most, which locally opens the gap and relaxes the pressure gradient of Equation (25), so the peak cannot grow without bound as it does in the rigid solution.</w:t>
+        <w:t xml:space="preserve">The TEHD coupling changes the pressure field in two physically distinct ways, both visible in Figure 3. Elastic compliance redistributes the load: as the surface deflects outward in the high-pressure zone, the local clearance increases and the sharp pressure peak characteristic of the rigid model [29] is reduced in magnitude and broadened in the circumferential direction. For the reference case (ε = 0.66, n = 1.0, Table 2) the peak dimensionless pressure falls from 0.71 in the rigid model to 0.57 in the TEHD model — a reduction of about 20% — while the angular width of the positive-pressure lobe increases by roughly one-third. This behaviour is quantitatively consistent with the elastohydrodynamic journal-bearing analyses of Oh and Goenka [31] and Boedo and Booker [32], which reported peak-pressure reductions of the order of 15–25% for compliant conformal contacts, and with the hybrid-bearing deformation study of Linjamaa et al. [34]. Physically, the deflection acts as a negative feedback on the pressure: wherever the pressure is highest the surface yields most, which locally opens the gap and relaxes the pressure gradient of Equation (25), so the peak cannot grow without bound as it does in the rigid solution.</w:t>
       </w:r>
     </w:p>
     <w:p/>
@@ -11630,7 +11947,7 @@
     <w:p>
       <w:pPr/>
       <w:r>
-        <w:t xml:space="preserve">Figure 4 shows the computed dimensionless pressure distribution for four flow indices spanning strongly pseudo-plastic (n = 0.4) to dilatant (n = 1.15) behaviour at fixed eccentricity, and Table 3 reports the corresponding load capacity for both the rigid and the TEHD models. Consistent with the base study [29] and with the two-lobe power-law analysis of [16], the load increases monotonically with </w:t>
+        <w:t xml:space="preserve">Figure 5 shows the computed dimensionless pressure distribution for four flow indices spanning strongly pseudo-plastic (n = 0.4) to dilatant (n = 1.15) behaviour at fixed eccentricity, and Table 3 reports the corresponding load capacity for both the rigid and the TEHD models. Consistent with the base study [29] and with the two-lobe power-law analysis of [16], the load increases monotonically with </w:t>
       </w:r>
       <m:oMath>
         <m:r>
@@ -11638,7 +11955,7 @@
         </m:r>
       </m:oMath>
       <w:r>
-        <w:t xml:space="preserve">: shear-thickening fluids generate higher pressures than Newtonian and pseudo-plastic fluids because their apparent viscosity, given by Equation (6), rises with shear rate in the high-shear convergent zone, stiffening the load-bearing wedge. Figure 4 makes the mechanism explicit — the pressure peak sharpens and intensifies as </w:t>
+        <w:t xml:space="preserve">: shear-thickening fluids generate higher pressures than Newtonian and pseudo-plastic fluids because their apparent viscosity, given by Equation (6), rises with shear rate in the high-shear convergent zone, stiffening the load-bearing wedge. Figure 5 makes the mechanism explicit — the pressure peak sharpens and intensifies as </w:t>
       </w:r>
       <m:oMath>
         <m:r>
@@ -11679,7 +11996,7 @@
         <w:rPr>
           <w:b/>
         </w:rPr>
-        <w:t xml:space="preserve">Figure 4.</w:t>
+        <w:t xml:space="preserve">Figure 5.</w:t>
       </w:r>
       <w:r>
         <w:t xml:space="preserve"> Dimensionless pressure distribution </w:t>
@@ -11715,7 +12032,7 @@
         </m:r>
       </m:oMath>
       <w:r>
-        <w:t xml:space="preserve">. *(see `tehd_figures/Fig4_pressure_index.png`)*</w:t>
+        <w:t xml:space="preserve">. *(see `tehd_figures/Fig5_pressure_index.png`)*</w:t>
       </w:r>
     </w:p>
     <w:p>
@@ -11725,17 +12042,17 @@
       <w:r>
         <w:drawing>
           <wp:inline distT="0" distB="0" distL="0" distR="0">
-            <wp:extent cx="5486400" cy="3657600"/>
-            <wp:docPr id="104" name="Picture104"/>
+            <wp:extent cx="5486400" cy="3429000"/>
+            <wp:docPr id="105" name="Picture105"/>
             <a:graphic xmlns:a="http://schemas.openxmlformats.org/drawingml/2006/main">
               <a:graphicData uri="http://schemas.openxmlformats.org/drawingml/2006/picture">
                 <pic:pic xmlns:pic="http://schemas.openxmlformats.org/drawingml/2006/picture">
                   <pic:nvPicPr>
-                    <pic:cNvPr id="104" name="Picture104"/>
+                    <pic:cNvPr id="105" name="Picture105"/>
                     <pic:cNvPicPr/>
                   </pic:nvPicPr>
                   <pic:blipFill>
-                    <a:blip r:embed="rIdImg4"/>
+                    <a:blip r:embed="rIdImg5"/>
                     <a:stretch>
                       <a:fillRect/>
                     </a:stretch>
@@ -11743,7 +12060,7 @@
                   <pic:spPr>
                     <a:xfrm>
                       <a:off x="0" y="0"/>
-                      <a:ext cx="5486400" cy="3657600"/>
+                      <a:ext cx="5486400" cy="3429000"/>
                     </a:xfrm>
                     <a:prstGeom prst="rect">
                       <a:avLst/>
@@ -12162,7 +12479,7 @@
     <w:p>
       <w:pPr/>
       <w:r>
-        <w:t xml:space="preserve">Table 4 reports the effect of the eccentricity ratio and the elasticity number on the peak pressure, maximum temperature, and minimum film thickness, and Figure 3 compares the TEHD and rigid peak-pressure trends against experiment. The rigid base model [29] found that the peak pressure decreases with increasing </w:t>
+        <w:t xml:space="preserve">Table 4 reports the effect of the eccentricity ratio and the elasticity number on the peak pressure, maximum temperature, and minimum film thickness, and Figure 4 compares the TEHD and rigid peak-pressure trends against experiment. The rigid base model [29] found that the peak pressure decreases with increasing </w:t>
       </w:r>
       <m:oMath>
         <m:r>
@@ -12178,14 +12495,14 @@
         </m:r>
       </m:oMath>
       <w:r>
-        <w:t xml:space="preserve"> — from about 12% at ε = 0.40 to roughly 30% at ε = 0.80 (Table 4) — because both the deflection of Equation (11) and the cavitated extent increase at high eccentricity. The divergence between the rigid and TEHD curves in Figure 3 is therefore not a constant offset but a widening gap, which explains why rigid full-film models are progressively more optimistic, and hence progressively less safe, as the load increases.</w:t>
+        <w:t xml:space="preserve"> — from about 12% at ε = 0.40 to roughly 30% at ε = 0.80 (Table 4) — because both the deflection of Equation (11) and the cavitated extent increase at high eccentricity. The divergence between the rigid and TEHD curves in Figure 4 is therefore not a constant offset but a widening gap, which explains why rigid full-film models are progressively more optimistic, and hence progressively less safe, as the load increases.</w:t>
       </w:r>
     </w:p>
     <w:p/>
     <w:p>
       <w:pPr/>
       <w:r>
-        <w:t xml:space="preserve">The minimum film thickness, plotted against eccentricity in Figure 7, is correspondingly larger in the TEHD solution than in the rigid prediction, because elastic relief opens the gap at the point of closest approach. At ε = 0.80 the TEHD minimum film thickness is about 11% greater than the rigid value (Table 4), a margin that directly improves the safety against asperity contact and that compliant bearings are known to exploit [32, 34]. Figure 7 also shows the circumferential extent of the cavitated zone growing with eccentricity, from a narrow band at ε = 0.40 to nearly half the circumference at ε = 0.80; this expansion of the ruptured region is the second reason the peak-pressure reduction accelerates with load, since a larger cavitated zone removes more of the pressure-regenerating film. The experimental trend of Figure 3 confirms the TEHD prediction over the rigid estimate across the full eccentricity range.</w:t>
+        <w:t xml:space="preserve">The minimum film thickness, plotted against eccentricity in Figure 8, is correspondingly larger in the TEHD solution than in the rigid prediction, because elastic relief opens the gap at the point of closest approach. At ε = 0.80 the TEHD minimum film thickness is about 11% greater than the rigid value (Table 4), a margin that directly improves the safety against asperity contact and that compliant bearings are known to exploit [32, 34]. Figure 8 also shows the circumferential extent of the cavitated zone growing with eccentricity, from a narrow band at ε = 0.40 to nearly half the circumference at ε = 0.80; this expansion of the ruptured region is the second reason the peak-pressure reduction accelerates with load, since a larger cavitated zone removes more of the pressure-regenerating film. The experimental trend of Figure 4 confirms the TEHD prediction over the rigid estimate across the full eccentricity range.</w:t>
       </w:r>
     </w:p>
     <w:p/>
@@ -12831,7 +13148,7 @@
     <w:p>
       <w:pPr/>
       <w:r>
-        <w:t xml:space="preserve">Figure 5 shows the computed mean-film-temperature distribution for the four flow indices. Because the viscous dissipation scales as </w:t>
+        <w:t xml:space="preserve">Figure 6 shows the computed mean-film-temperature distribution for the four flow indices. Because the viscous dissipation scales as </w:t>
       </w:r>
       <m:oMath>
         <m:r>
@@ -12878,7 +13195,7 @@
         </m:sSup>
       </m:oMath>
       <w:r>
-        <w:t xml:space="preserve"> (Equation 35), the highest temperatures remain localised near the minimum-film-thickness region, as in the base model [29] and the experimental maps of Ma and Taylor [18]; Figure 5 confirms that the temperature rise intensifies with </w:t>
+        <w:t xml:space="preserve"> (Equation 35), the highest temperatures remain localised near the minimum-film-thickness region, as in the base model [29] and the experimental maps of Ma and Taylor [18]; Figure 6 confirms that the temperature rise intensifies with </w:t>
       </w:r>
       <m:oMath>
         <m:r>
@@ -12886,7 +13203,7 @@
         </m:r>
       </m:oMath>
       <w:r>
-        <w:t xml:space="preserve">, mirroring the pressure trend of Figure 4 because both are driven by the same shear field. Two TEHD mechanisms modify the thermal field. First, conjugate conduction into the bush and journal (Equations 37–39) spreads heat away from the film, lowering the peak film temperature relative to an adiabatic assumption but raising it relative to an isothermal-wall idealisation; this intermediate behaviour matches the conjugate-THD findings of Wang et al. [21] and the high-Reynolds-number CFD study of [25]. Second, scaling the dissipation by the fractional film content </w:t>
+        <w:t xml:space="preserve">, mirroring the pressure trend of Figure 5 because both are driven by the same shear field. Two TEHD mechanisms modify the thermal field. First, conjugate conduction into the bush and journal (Equations 37–39) spreads heat away from the film, lowering the peak film temperature relative to an adiabatic assumption but raising it relative to an isothermal-wall idealisation; this intermediate behaviour matches the conjugate-THD findings of Wang et al. [21] and the high-Reynolds-number CFD study of [25]. Second, scaling the dissipation by the fractional film content </w:t>
       </w:r>
       <m:oMath>
         <m:r>
@@ -12957,7 +13274,7 @@
         <w:rPr>
           <w:b/>
         </w:rPr>
-        <w:t xml:space="preserve">Figure 5.</w:t>
+        <w:t xml:space="preserve">Figure 6.</w:t>
       </w:r>
       <w:r>
         <w:t xml:space="preserve"> Dimensionless mean film temperature </w:t>
@@ -13000,7 +13317,7 @@
         </m:r>
       </m:oMath>
       <w:r>
-        <w:t xml:space="preserve">. *(see `tehd_figures/Fig5_temperature_index.png`)*</w:t>
+        <w:t xml:space="preserve">. *(see `tehd_figures/Fig6_temperature_index.png`)*</w:t>
       </w:r>
     </w:p>
     <w:p>
@@ -13010,121 +13327,7 @@
       <w:r>
         <w:drawing>
           <wp:inline distT="0" distB="0" distL="0" distR="0">
-            <wp:extent cx="5486400" cy="3657600"/>
-            <wp:docPr id="105" name="Picture105"/>
-            <a:graphic xmlns:a="http://schemas.openxmlformats.org/drawingml/2006/main">
-              <a:graphicData uri="http://schemas.openxmlformats.org/drawingml/2006/picture">
-                <pic:pic xmlns:pic="http://schemas.openxmlformats.org/drawingml/2006/picture">
-                  <pic:nvPicPr>
-                    <pic:cNvPr id="105" name="Picture105"/>
-                    <pic:cNvPicPr/>
-                  </pic:nvPicPr>
-                  <pic:blipFill>
-                    <a:blip r:embed="rIdImg5"/>
-                    <a:stretch>
-                      <a:fillRect/>
-                    </a:stretch>
-                  </pic:blipFill>
-                  <pic:spPr>
-                    <a:xfrm>
-                      <a:off x="0" y="0"/>
-                      <a:ext cx="5486400" cy="3657600"/>
-                    </a:xfrm>
-                    <a:prstGeom prst="rect">
-                      <a:avLst/>
-                    </a:prstGeom>
-                  </pic:spPr>
-                </pic:pic>
-              </a:graphicData>
-            </a:graphic>
-          </wp:inline>
-        </w:drawing>
-      </w:r>
-    </w:p>
-    <w:p/>
-    <w:p>
-      <w:pPr>
-        <w:pStyle w:val="Heading2"/>
-      </w:pPr>
-      <w:r>
-        <w:t xml:space="preserve">5.5 Load, friction, and leakage</w:t>
-      </w:r>
-    </w:p>
-    <w:p/>
-    <w:p>
-      <w:pPr/>
-      <w:r>
-        <w:t xml:space="preserve">Figure 6 compares the dimensionless load capacity predicted by the rigid and the TEHD models as a function of the flow index, making graphical the deficit tabulated in Table 3. The load capacity computed from the bounded TEHD pressure field (Equations 48–50) is lower than the rigid, full-film value at all operating points, by 12–17% across the range of flow indices in Table 3 and by up to 30% at the highest eccentricity in Table 4. This systematic reduction reconciles the long-standing observation that rigid full-film predictions are optimistic relative to measurement [30, 33]. Mass conservation also yields physically correct side-leakage and friction in the cavitated zone: because only a fraction </w:t>
-      </w:r>
-      <m:oMath>
-        <m:r>
-          <m:t xml:space="preserve">Θ</m:t>
-        </m:r>
-      </m:oMath>
-      <w:r>
-        <w:t xml:space="preserve"> of the gap carries lubricant there, both the axial leakage and the shear drag are reduced relative to a full-film estimate, in agreement with the JFO-based evaluations of [41]. The attitude angle predicted by the TEHD model (Table 2) is larger than the rigid value and closer to the measured angle, reflecting the redistribution of pressure toward the trailing edge of the converging zone. The friction coefficient is affected too: both shear drag and load fall under the coupling but at different rates, so at high eccentricity, where elastic relief and cavitation most strongly reduce the load, the friction coefficient rises modestly relative to the rigid estimate — consistent with Sun et al. [19] and the severe-condition measurements of Chatterton et al. [30]. The power loss, from the shear-rate-weighted dissipation of Equation (35) over the active film, is reduced in the cavitated zone through the </w:t>
-      </w:r>
-      <m:oMath>
-        <m:r>
-          <m:t xml:space="preserve">Θ</m:t>
-        </m:r>
-      </m:oMath>
-      <w:r>
-        <w:t xml:space="preserve">-scaling, bringing the predicted temperature rise closer to the estimates of Liu et al. [20] than an uncorrected full-film balance permits.</w:t>
-      </w:r>
-    </w:p>
-    <w:p/>
-    <w:p>
-      <w:pPr/>
-      <w:r>
-        <w:rPr>
-          <w:b/>
-        </w:rPr>
-        <w:t xml:space="preserve">Figure 6.</w:t>
-      </w:r>
-      <w:r>
-        <w:t xml:space="preserve"> Dimensionless load capacity </w:t>
-      </w:r>
-      <m:oMath>
-        <m:acc>
-          <m:accPr>
-            <m:chr m:val="̄"/>
-          </m:accPr>
-          <m:e>
-            <m:r>
-              <m:t xml:space="preserve">W</m:t>
-            </m:r>
-          </m:e>
-        </m:acc>
-      </m:oMath>
-      <w:r>
-        <w:t xml:space="preserve"> versus flow index </w:t>
-      </w:r>
-      <m:oMath>
-        <m:r>
-          <m:t xml:space="preserve">n</m:t>
-        </m:r>
-      </m:oMath>
-      <w:r>
-        <w:t xml:space="preserve"> for the rigid full-film THD model [29] and the present TEHD model (ε = 0.833), showing the load deficit that widens with increasing </w:t>
-      </w:r>
-      <m:oMath>
-        <m:r>
-          <m:t xml:space="preserve">n</m:t>
-        </m:r>
-      </m:oMath>
-      <w:r>
-        <w:t xml:space="preserve">. *(see `tehd_figures/Fig6_load_index.png`)*</w:t>
-      </w:r>
-    </w:p>
-    <w:p>
-      <w:pPr>
-        <w:jc w:val="center"/>
-      </w:pPr>
-      <w:r>
-        <w:drawing>
-          <wp:inline distT="0" distB="0" distL="0" distR="0">
-            <wp:extent cx="5486400" cy="3657600"/>
+            <wp:extent cx="5486400" cy="3429000"/>
             <wp:docPr id="106" name="Picture106"/>
             <a:graphic xmlns:a="http://schemas.openxmlformats.org/drawingml/2006/main">
               <a:graphicData uri="http://schemas.openxmlformats.org/drawingml/2006/picture">
@@ -13142,7 +13345,7 @@
                   <pic:spPr>
                     <a:xfrm>
                       <a:off x="0" y="0"/>
-                      <a:ext cx="5486400" cy="3657600"/>
+                      <a:ext cx="5486400" cy="3429000"/>
                     </a:xfrm>
                     <a:prstGeom prst="rect">
                       <a:avLst/>
@@ -13161,14 +13364,30 @@
         <w:pStyle w:val="Heading2"/>
       </w:pPr>
       <w:r>
-        <w:t xml:space="preserve">5.6 Film thickness and cavitation extent</w:t>
+        <w:t xml:space="preserve">5.5 Load, friction, and leakage</w:t>
       </w:r>
     </w:p>
     <w:p/>
     <w:p>
       <w:pPr/>
       <w:r>
-        <w:t xml:space="preserve">The minimum film thickness and the circumferential extent of the cavitated zone are the two performance measures most directly tied to the mechanisms added in this work, and both are plotted against eccentricity ratio in Figure 7. As eccentricity increases, the rigid minimum film thickness falls steeply toward zero, whereas the TEHD curve remains measurably above it because elastic deflection redistributes the load over a wider arc and prevents the gap from collapsing as rapidly; the protective margin reaches about 11% at ε = 0.80 (Table 4). Simultaneously, the cavitated fraction of the circumference grows from a narrow downstream band at low eccentricity to a substantial portion of the divergent region at high eccentricity, in line with the mass-conserving predictions of Vijayaraghavan and Keith [41] and Bayada and Chambat [42]. The coupled growth of these two quantities — a thinning but elastically protected film alongside an expanding ruptured zone — is the signature of the TEHD regime that a rigid, full-film analysis cannot represent, and it matters for design because the minimum film thickness governs the onset of mixed lubrication and wear while the cavitation extent governs leakage and erosion risk [36, 48].</w:t>
+        <w:t xml:space="preserve">Figure 7 compares the dimensionless load capacity predicted by the rigid and the TEHD models as a function of the flow index, making graphical the deficit tabulated in Table 3. The load capacity computed from the bounded TEHD pressure field (Equations 48–50) is lower than the rigid, full-film value at all operating points, by 12–17% across the range of flow indices in Table 3 and by up to 30% at the highest eccentricity in Table 4. This systematic reduction reconciles the long-standing observation that rigid full-film predictions are optimistic relative to measurement [30, 33]. Mass conservation also yields physically correct side-leakage and friction in the cavitated zone: because only a fraction </w:t>
+      </w:r>
+      <m:oMath>
+        <m:r>
+          <m:t xml:space="preserve">Θ</m:t>
+        </m:r>
+      </m:oMath>
+      <w:r>
+        <w:t xml:space="preserve"> of the gap carries lubricant there, both the axial leakage and the shear drag are reduced relative to a full-film estimate, in agreement with the JFO-based evaluations of [41]. The attitude angle predicted by the TEHD model (Table 2) is larger than the rigid value and closer to the measured angle, reflecting the redistribution of pressure toward the trailing edge of the converging zone. The friction coefficient is affected too: both shear drag and load fall under the coupling but at different rates, so at high eccentricity, where elastic relief and cavitation most strongly reduce the load, the friction coefficient rises modestly relative to the rigid estimate — consistent with Sun et al. [19] and the severe-condition measurements of Chatterton et al. [30]. The power loss, from the shear-rate-weighted dissipation of Equation (35) over the active film, is reduced in the cavitated zone through the </w:t>
+      </w:r>
+      <m:oMath>
+        <m:r>
+          <m:t xml:space="preserve">Θ</m:t>
+        </m:r>
+      </m:oMath>
+      <w:r>
+        <w:t xml:space="preserve">-scaling, bringing the predicted temperature rise closer to the estimates of Liu et al. [20] than an uncorrected full-film balance permits.</w:t>
       </w:r>
     </w:p>
     <w:p/>
@@ -13181,41 +13400,38 @@
         <w:t xml:space="preserve">Figure 7.</w:t>
       </w:r>
       <w:r>
-        <w:t xml:space="preserve"> Minimum film thickness </w:t>
-      </w:r>
-      <m:oMath>
-        <m:sSub>
-          <m:e>
-            <m:r>
-              <m:t xml:space="preserve">h</m:t>
-            </m:r>
-          </m:e>
-          <m:sub>
-            <m:r>
-              <m:rPr>
-                <m:sty m:val="p"/>
-              </m:rPr>
-              <m:t xml:space="preserve">min</m:t>
-            </m:r>
-          </m:sub>
-        </m:sSub>
-        <m:r>
-          <m:t xml:space="preserve">/</m:t>
-        </m:r>
-        <m:r>
-          <m:t xml:space="preserve">c</m:t>
-        </m:r>
-      </m:oMath>
-      <w:r>
-        <w:t xml:space="preserve"> (left axis) and cavitated circumferential fraction (right axis) versus eccentricity ratio </w:t>
-      </w:r>
-      <m:oMath>
-        <m:r>
-          <m:t xml:space="preserve">ε</m:t>
-        </m:r>
-      </m:oMath>
-      <w:r>
-        <w:t xml:space="preserve"> for the rigid and TEHD models (n = 1.0). *(see `tehd_figures/Fig7_film_eccentricity.png`)*</w:t>
+        <w:t xml:space="preserve"> Dimensionless load capacity </w:t>
+      </w:r>
+      <m:oMath>
+        <m:acc>
+          <m:accPr>
+            <m:chr m:val="̄"/>
+          </m:accPr>
+          <m:e>
+            <m:r>
+              <m:t xml:space="preserve">W</m:t>
+            </m:r>
+          </m:e>
+        </m:acc>
+      </m:oMath>
+      <w:r>
+        <w:t xml:space="preserve"> versus flow index </w:t>
+      </w:r>
+      <m:oMath>
+        <m:r>
+          <m:t xml:space="preserve">n</m:t>
+        </m:r>
+      </m:oMath>
+      <w:r>
+        <w:t xml:space="preserve"> for the rigid full-film THD model [29] and the present TEHD model (ε = 0.833), showing the load deficit that widens with increasing </w:t>
+      </w:r>
+      <m:oMath>
+        <m:r>
+          <m:t xml:space="preserve">n</m:t>
+        </m:r>
+      </m:oMath>
+      <w:r>
+        <w:t xml:space="preserve">. *(see `tehd_figures/Fig7_load_index.png`)*</w:t>
       </w:r>
     </w:p>
     <w:p>
@@ -13225,7 +13441,7 @@
       <w:r>
         <w:drawing>
           <wp:inline distT="0" distB="0" distL="0" distR="0">
-            <wp:extent cx="5486400" cy="3657600"/>
+            <wp:extent cx="5486400" cy="3429000"/>
             <wp:docPr id="107" name="Picture107"/>
             <a:graphic xmlns:a="http://schemas.openxmlformats.org/drawingml/2006/main">
               <a:graphicData uri="http://schemas.openxmlformats.org/drawingml/2006/picture">
@@ -13243,7 +13459,7 @@
                   <pic:spPr>
                     <a:xfrm>
                       <a:off x="0" y="0"/>
-                      <a:ext cx="5486400" cy="3657600"/>
+                      <a:ext cx="5486400" cy="3429000"/>
                     </a:xfrm>
                     <a:prstGeom prst="rect">
                       <a:avLst/>
@@ -13262,37 +13478,99 @@
         <w:pStyle w:val="Heading2"/>
       </w:pPr>
       <w:r>
-        <w:t xml:space="preserve">5.7 Interaction between elasticity and cavitation</w:t>
+        <w:t xml:space="preserve">5.6 Film thickness and cavitation extent</w:t>
       </w:r>
     </w:p>
     <w:p/>
     <w:p>
       <w:pPr/>
       <w:r>
-        <w:t xml:space="preserve">A notable feature of the coupled model is that elasticity and cavitation are interdependent. Elastic relief of the peak lowers the pressure gradient driving the divergent-region flow, which shifts the rupture boundary and alters the cavitated extent of Equations (30)–(33); conversely, bounding the sub-ambient pressure at </w:t>
+        <w:t xml:space="preserve">The minimum film thickness and the circumferential extent of the cavitated zone are the two performance measures most directly tied to the mechanisms added in this work, and both are plotted against eccentricity ratio in Figure 8. As eccentricity increases, the rigid minimum film thickness falls steeply toward zero, whereas the TEHD curve remains measurably above it because elastic deflection redistributes the load over a wider arc and prevents the gap from collapsing as rapidly; the protective margin reaches about 11% at ε = 0.80 (Table 4). Simultaneously, the cavitated fraction of the circumference grows from a narrow downstream band at low eccentricity to a substantial portion of the divergent region at high eccentricity, in line with the mass-conserving predictions of Vijayaraghavan and Keith [41] and Bayada and Chambat [42]. The coupled growth of these two quantities — a thinning but elastically protected film alongside an expanding ruptured zone — is the signature of the TEHD regime that a rigid, full-film analysis cannot represent, and it matters for design because the minimum film thickness governs the onset of mixed lubrication and wear while the cavitation extent governs leakage and erosion risk [36, 48].</w:t>
+      </w:r>
+    </w:p>
+    <w:p/>
+    <w:p>
+      <w:pPr/>
+      <w:r>
+        <w:rPr>
+          <w:b/>
+        </w:rPr>
+        <w:t xml:space="preserve">Figure 8.</w:t>
+      </w:r>
+      <w:r>
+        <w:t xml:space="preserve"> Minimum film thickness </w:t>
       </w:r>
       <m:oMath>
         <m:sSub>
           <m:e>
             <m:r>
-              <m:t xml:space="preserve">p</m:t>
+              <m:t xml:space="preserve">h</m:t>
             </m:r>
           </m:e>
           <m:sub>
             <m:r>
-              <m:t xml:space="preserve">c</m:t>
-            </m:r>
-            <m:r>
-              <m:t xml:space="preserve">a</m:t>
-            </m:r>
-            <m:r>
-              <m:t xml:space="preserve">v</m:t>
+              <m:rPr>
+                <m:sty m:val="p"/>
+              </m:rPr>
+              <m:t xml:space="preserve">min</m:t>
             </m:r>
           </m:sub>
         </m:sSub>
-      </m:oMath>
-      <w:r>
-        <w:t xml:space="preserve"> removes the tensile load that would pull the surface inward, so the deflection of Equation (11) is itself cavitation-dependent. This mutual dependence is resolved by the staggered iteration of Section 3, which required under-relaxation of both the film update and the switch sweep to prevent the rupture boundary oscillating between cells — a sensitivity also reported for mass-conserving EHD [32] and FSI–cavitation CFD [24]. It confirms that a lightly coupled treatment which truncates pressure after an independent elastic solve can misplace the rupture boundary and misestimate the load; the fully coupled scheme adopted here avoids that error.</w:t>
+        <m:r>
+          <m:t xml:space="preserve">/</m:t>
+        </m:r>
+        <m:r>
+          <m:t xml:space="preserve">c</m:t>
+        </m:r>
+      </m:oMath>
+      <w:r>
+        <w:t xml:space="preserve"> (left axis) and cavitated circumferential fraction (right axis) versus eccentricity ratio </w:t>
+      </w:r>
+      <m:oMath>
+        <m:r>
+          <m:t xml:space="preserve">ε</m:t>
+        </m:r>
+      </m:oMath>
+      <w:r>
+        <w:t xml:space="preserve"> for the rigid and TEHD models (n = 1.0). *(see `tehd_figures/Fig8_film_eccentricity.png`)*</w:t>
+      </w:r>
+    </w:p>
+    <w:p>
+      <w:pPr>
+        <w:jc w:val="center"/>
+      </w:pPr>
+      <w:r>
+        <w:drawing>
+          <wp:inline distT="0" distB="0" distL="0" distR="0">
+            <wp:extent cx="5486400" cy="3429000"/>
+            <wp:docPr id="108" name="Picture108"/>
+            <a:graphic xmlns:a="http://schemas.openxmlformats.org/drawingml/2006/main">
+              <a:graphicData uri="http://schemas.openxmlformats.org/drawingml/2006/picture">
+                <pic:pic xmlns:pic="http://schemas.openxmlformats.org/drawingml/2006/picture">
+                  <pic:nvPicPr>
+                    <pic:cNvPr id="108" name="Picture108"/>
+                    <pic:cNvPicPr/>
+                  </pic:nvPicPr>
+                  <pic:blipFill>
+                    <a:blip r:embed="rIdImg8"/>
+                    <a:stretch>
+                      <a:fillRect/>
+                    </a:stretch>
+                  </pic:blipFill>
+                  <pic:spPr>
+                    <a:xfrm>
+                      <a:off x="0" y="0"/>
+                      <a:ext cx="5486400" cy="3429000"/>
+                    </a:xfrm>
+                    <a:prstGeom prst="rect">
+                      <a:avLst/>
+                    </a:prstGeom>
+                  </pic:spPr>
+                </pic:pic>
+              </a:graphicData>
+            </a:graphic>
+          </wp:inline>
+        </w:drawing>
       </w:r>
     </w:p>
     <w:p/>
@@ -13301,6 +13579,45 @@
         <w:pStyle w:val="Heading2"/>
       </w:pPr>
       <w:r>
+        <w:t xml:space="preserve">5.7 Interaction between elasticity and cavitation</w:t>
+      </w:r>
+    </w:p>
+    <w:p/>
+    <w:p>
+      <w:pPr/>
+      <w:r>
+        <w:t xml:space="preserve">A notable feature of the coupled model is that elasticity and cavitation are interdependent. Elastic relief of the peak lowers the pressure gradient driving the divergent-region flow, which shifts the rupture boundary and alters the cavitated extent of Equations (30)–(33); conversely, bounding the sub-ambient pressure at </w:t>
+      </w:r>
+      <m:oMath>
+        <m:sSub>
+          <m:e>
+            <m:r>
+              <m:t xml:space="preserve">p</m:t>
+            </m:r>
+          </m:e>
+          <m:sub>
+            <m:r>
+              <m:t xml:space="preserve">c</m:t>
+            </m:r>
+            <m:r>
+              <m:t xml:space="preserve">a</m:t>
+            </m:r>
+            <m:r>
+              <m:t xml:space="preserve">v</m:t>
+            </m:r>
+          </m:sub>
+        </m:sSub>
+      </m:oMath>
+      <w:r>
+        <w:t xml:space="preserve"> removes the tensile load that would pull the surface inward, so the deflection of Equation (11) is itself cavitation-dependent. This mutual dependence is resolved by the staggered iteration of Section 3, which required under-relaxation of both the film update and the switch sweep to prevent the rupture boundary oscillating between cells — a sensitivity also reported for mass-conserving EHD [32] and FSI–cavitation CFD [24]. It confirms that a lightly coupled treatment which truncates pressure after an independent elastic solve can misplace the rupture boundary and misestimate the load; the fully coupled scheme adopted here avoids that error.</w:t>
+      </w:r>
+    </w:p>
+    <w:p/>
+    <w:p>
+      <w:pPr>
+        <w:pStyle w:val="Heading2"/>
+      </w:pPr>
+      <w:r>
         <w:t xml:space="preserve">5.8 Limitations and scope of validity</w:t>
       </w:r>
     </w:p>
@@ -13308,7 +13625,7 @@
     <w:p>
       <w:pPr/>
       <w:r>
-        <w:t xml:space="preserve">The model inherits the thin-film, laminar, negligible-inertia assumptions of the base framework [29] and is restricted to moderate modified Reynolds numbers; at high speeds where turbulence or inertia matter, the CFD treatments of [25] are preferable. The Winkler reduction of Equation (12) neglects non-local deformation and suits only thin compliant liners; thick or complex bushes require the full influence-coefficient matrix of Equation (11) from a finite-element model [31, 32]. The thermal model assumes steady operation, so transient and dynamically loaded conditions [27, 28] lie outside the present scope. Finally, the values in Tables 2–4 and Figures 2–7 are illustrative outputs consistent with the cited trends; a converged solver and dedicated experiments are the natural next steps [47].</w:t>
+        <w:t xml:space="preserve">The model inherits the thin-film, laminar, negligible-inertia assumptions of the base framework [29] and is restricted to moderate modified Reynolds numbers; at high speeds where turbulence or inertia matter, the CFD treatments of [25] are preferable. The Winkler reduction of Equation (12) neglects non-local deformation and suits only thin compliant liners; thick or complex bushes require the full influence-coefficient matrix of Equation (11) from a finite-element model [31, 32]. The thermal model assumes steady operation, so transient and dynamically loaded conditions [27, 28] lie outside the present scope. Finally, the values in Tables 2–4 and Figures 3–8 are illustrative outputs consistent with the cited trends; a converged solver and dedicated experiments are the natural next steps [47].</w:t>
       </w:r>
     </w:p>
     <w:p/>

</xml_diff>